<commit_message>
Harden robot control and align safety documentation
Fail closed on malformed, stale, replayed, or unauthorised command paths; harden HID, IK, actuator, launcher, and build boundaries; and align tests plus documentation with the resulting behavior.

Keep the physical fail-off, authenticated deployment policy, verified model, and QNX target-validation requirements explicit rather than claiming production certification.
</commit_message>
<xml_diff>
--- a/docs/QNX_Hands-On_Teaching_Module_-_Baby_Robot_Arm.docx
+++ b/docs/QNX_Hands-On_Teaching_Module_-_Baby_Robot_Arm.docx
@@ -60,107 +60,7 @@
           <w:szCs w:val="21"/>
           <w14:ligatures w14:val="none"/>
         </w:rPr>
-        <w:t xml:space="preserve">A hands-on robotics project where students build and control a robotic arm using a game controller and ROS2 </w:t>
-      </w:r>
-      <w:r>
-        <w:rPr>
-          <w:rFonts w:ascii="Onest" w:eastAsia="Times New Roman" w:hAnsi="Onest" w:cs="Segoe UI"/>
-          <w:kern w:val="0"/>
-          <w:sz w:val="21"/>
-          <w:szCs w:val="21"/>
-          <w14:ligatures w14:val="none"/>
-        </w:rPr>
-        <w:t xml:space="preserve">using the QNX Real Time Operating System </w:t>
-      </w:r>
-      <w:r>
-        <w:rPr>
-          <w:rFonts w:ascii="Onest" w:eastAsia="Times New Roman" w:hAnsi="Onest" w:cs="Segoe UI"/>
-          <w:kern w:val="0"/>
-          <w:sz w:val="21"/>
-          <w:szCs w:val="21"/>
-          <w14:ligatures w14:val="none"/>
-        </w:rPr>
-        <w:t xml:space="preserve">on </w:t>
-      </w:r>
-      <w:r>
-        <w:rPr>
-          <w:rFonts w:ascii="Onest" w:eastAsia="Times New Roman" w:hAnsi="Onest" w:cs="Segoe UI"/>
-          <w:kern w:val="0"/>
-          <w:sz w:val="21"/>
-          <w:szCs w:val="21"/>
-          <w14:ligatures w14:val="none"/>
-        </w:rPr>
-        <w:t xml:space="preserve">a </w:t>
-      </w:r>
-      <w:r>
-        <w:rPr>
-          <w:rFonts w:ascii="Onest" w:eastAsia="Times New Roman" w:hAnsi="Onest" w:cs="Segoe UI"/>
-          <w:kern w:val="0"/>
-          <w:sz w:val="21"/>
-          <w:szCs w:val="21"/>
-          <w14:ligatures w14:val="none"/>
-        </w:rPr>
-        <w:t>Raspberry Pi. The project teaches robotics fundamentals, embedded systems, and real-time control through practical experimentation</w:t>
-      </w:r>
-      <w:r>
-        <w:rPr>
-          <w:rFonts w:ascii="Onest" w:eastAsia="Times New Roman" w:hAnsi="Onest" w:cs="Segoe UI"/>
-          <w:kern w:val="0"/>
-          <w:sz w:val="21"/>
-          <w:szCs w:val="21"/>
-          <w14:ligatures w14:val="none"/>
-        </w:rPr>
-        <w:t xml:space="preserve">. It </w:t>
-      </w:r>
-      <w:r>
-        <w:rPr>
-          <w:rFonts w:ascii="Onest" w:eastAsia="Times New Roman" w:hAnsi="Onest" w:cs="Segoe UI"/>
-          <w:kern w:val="0"/>
-          <w:sz w:val="21"/>
-          <w:szCs w:val="21"/>
-          <w14:ligatures w14:val="none"/>
-        </w:rPr>
-        <w:t xml:space="preserve">provides early exposure to </w:t>
-      </w:r>
-      <w:r>
-        <w:rPr>
-          <w:rFonts w:ascii="Onest" w:eastAsia="Times New Roman" w:hAnsi="Onest" w:cs="Segoe UI"/>
-          <w:kern w:val="0"/>
-          <w:sz w:val="21"/>
-          <w:szCs w:val="21"/>
-          <w14:ligatures w14:val="none"/>
-        </w:rPr>
-        <w:t xml:space="preserve">and familiarity with </w:t>
-      </w:r>
-      <w:r>
-        <w:rPr>
-          <w:rFonts w:ascii="Onest" w:eastAsia="Times New Roman" w:hAnsi="Onest" w:cs="Segoe UI"/>
-          <w:kern w:val="0"/>
-          <w:sz w:val="21"/>
-          <w:szCs w:val="21"/>
-          <w14:ligatures w14:val="none"/>
-        </w:rPr>
-        <w:t xml:space="preserve">technology that is widely used in industry </w:t>
-      </w:r>
-      <w:r>
-        <w:rPr>
-          <w:rFonts w:ascii="Onest" w:eastAsia="Times New Roman" w:hAnsi="Onest" w:cs="Segoe UI"/>
-          <w:kern w:val="0"/>
-          <w:sz w:val="21"/>
-          <w:szCs w:val="21"/>
-          <w14:ligatures w14:val="none"/>
-        </w:rPr>
-        <w:t xml:space="preserve">to build </w:t>
-      </w:r>
-      <w:r>
-        <w:rPr>
-          <w:rFonts w:ascii="Onest" w:eastAsia="Times New Roman" w:hAnsi="Onest" w:cs="Segoe UI"/>
-          <w:kern w:val="0"/>
-          <w:sz w:val="21"/>
-          <w:szCs w:val="21"/>
-          <w14:ligatures w14:val="none"/>
-        </w:rPr>
-        <w:t>reliable embedded systems.</w:t>
+        <w:t>A hands-on robotics project where students build and control a robotic arm using a game controller and ROS2 on the QNX Real Time Operating System on a Raspberry Pi. The project teaches robotics fundamentals, embedded systems, and periodic 50 Hz control through practical experimentation. It introduces how a real-time operating system supports responsive embedded applications.</w:t>
       </w:r>
     </w:p>
     <w:p>
@@ -284,97 +184,7 @@
           <w:szCs w:val="21"/>
           <w14:ligatures w14:val="none"/>
         </w:rPr>
-        <w:t xml:space="preserve">This project demonstrates how to </w:t>
-      </w:r>
-      <w:r>
-        <w:rPr>
-          <w:rFonts w:ascii="Onest" w:eastAsia="Times New Roman" w:hAnsi="Onest" w:cs="Segoe UI"/>
-          <w:kern w:val="0"/>
-          <w:sz w:val="21"/>
-          <w:szCs w:val="21"/>
-          <w14:ligatures w14:val="none"/>
-        </w:rPr>
-        <w:t xml:space="preserve">control a 6-degree-of-freedom robotic arm using a gamepad controller and ROS2 software </w:t>
-      </w:r>
-      <w:r>
-        <w:rPr>
-          <w:rFonts w:ascii="Onest" w:eastAsia="Times New Roman" w:hAnsi="Onest" w:cs="Segoe UI"/>
-          <w:kern w:val="0"/>
-          <w:sz w:val="21"/>
-          <w:szCs w:val="21"/>
-          <w14:ligatures w14:val="none"/>
-        </w:rPr>
-        <w:t>using</w:t>
-      </w:r>
-      <w:r>
-        <w:rPr>
-          <w:rFonts w:ascii="Onest" w:eastAsia="Times New Roman" w:hAnsi="Onest" w:cs="Segoe UI"/>
-          <w:kern w:val="0"/>
-          <w:sz w:val="21"/>
-          <w:szCs w:val="21"/>
-          <w14:ligatures w14:val="none"/>
-        </w:rPr>
-        <w:t xml:space="preserve"> </w:t>
-      </w:r>
-      <w:r>
-        <w:rPr>
-          <w:rFonts w:ascii="Onest" w:eastAsia="Times New Roman" w:hAnsi="Onest" w:cs="Segoe UI"/>
-          <w:kern w:val="0"/>
-          <w:sz w:val="21"/>
-          <w:szCs w:val="21"/>
-          <w14:ligatures w14:val="none"/>
-        </w:rPr>
-        <w:t xml:space="preserve">QNX on a </w:t>
-      </w:r>
-      <w:r>
-        <w:rPr>
-          <w:rFonts w:ascii="Onest" w:eastAsia="Times New Roman" w:hAnsi="Onest" w:cs="Segoe UI"/>
-          <w:kern w:val="0"/>
-          <w:sz w:val="21"/>
-          <w:szCs w:val="21"/>
-          <w14:ligatures w14:val="none"/>
-        </w:rPr>
-        <w:t>Raspberry Pi.</w:t>
-      </w:r>
-      <w:r>
-        <w:rPr>
-          <w:rFonts w:ascii="Onest" w:eastAsia="Times New Roman" w:hAnsi="Onest" w:cs="Segoe UI"/>
-          <w:kern w:val="0"/>
-          <w:sz w:val="21"/>
-          <w:szCs w:val="21"/>
-          <w14:ligatures w14:val="none"/>
-        </w:rPr>
-        <w:t xml:space="preserve"> </w:t>
-      </w:r>
-      <w:r>
-        <w:rPr>
-          <w:rFonts w:ascii="Onest" w:eastAsia="Times New Roman" w:hAnsi="Onest" w:cs="Segoe UI"/>
-          <w:kern w:val="0"/>
-          <w:sz w:val="21"/>
-          <w:szCs w:val="21"/>
-          <w14:ligatures w14:val="none"/>
-        </w:rPr>
-        <w:t xml:space="preserve">Students learn how software, hardware, </w:t>
-      </w:r>
-      <w:r>
-        <w:rPr>
-          <w:rFonts w:ascii="Onest" w:eastAsia="Times New Roman" w:hAnsi="Onest" w:cs="Segoe UI"/>
-          <w:kern w:val="0"/>
-          <w:sz w:val="21"/>
-          <w:szCs w:val="21"/>
-          <w14:ligatures w14:val="none"/>
-        </w:rPr>
-        <w:t xml:space="preserve">mechanical, </w:t>
-      </w:r>
-      <w:r>
-        <w:rPr>
-          <w:rFonts w:ascii="Onest" w:eastAsia="Times New Roman" w:hAnsi="Onest" w:cs="Segoe UI"/>
-          <w:kern w:val="0"/>
-          <w:sz w:val="21"/>
-          <w:szCs w:val="21"/>
-          <w14:ligatures w14:val="none"/>
-        </w:rPr>
-        <w:t>and real-time systems work together to control physical devices.</w:t>
+        <w:t>This project demonstrates how to control a 5-degree-of-freedom robotic arm, plus a separately controlled gripper, using a gamepad and ROS2 software on QNX. Five articulated joints position and orient the arm, while the sixth servo opens and closes the gripper.</w:t>
       </w:r>
     </w:p>
     <w:p>
@@ -432,7 +242,7 @@
           <w:ilvl w:val="0"/>
           <w:numId w:val="2"/>
         </w:numPr>
-        <w:spacing w:before="100" w:beforeAutospacing="1" w:after="100" w:afterAutospacing="1" w:line="300" w:lineRule="atLeast"/>
+        <w:spacing w:before="0" w:beforeAutospacing="1" w:after="40" w:afterAutospacing="1" w:line="240" w:lineRule="auto"/>
         <w:rPr>
           <w:rFonts w:ascii="Onest" w:eastAsia="Times New Roman" w:hAnsi="Onest" w:cs="Segoe UI"/>
           <w:kern w:val="0"/>
@@ -458,7 +268,7 @@
           <w:ilvl w:val="0"/>
           <w:numId w:val="2"/>
         </w:numPr>
-        <w:spacing w:before="100" w:beforeAutospacing="1" w:after="100" w:afterAutospacing="1" w:line="300" w:lineRule="atLeast"/>
+        <w:spacing w:before="0" w:beforeAutospacing="1" w:after="40" w:afterAutospacing="1" w:line="240" w:lineRule="auto"/>
         <w:rPr>
           <w:rFonts w:ascii="Onest" w:eastAsia="Times New Roman" w:hAnsi="Onest" w:cs="Segoe UI"/>
           <w:kern w:val="0"/>
@@ -484,7 +294,7 @@
           <w:ilvl w:val="0"/>
           <w:numId w:val="2"/>
         </w:numPr>
-        <w:spacing w:before="100" w:beforeAutospacing="1" w:after="100" w:afterAutospacing="1" w:line="300" w:lineRule="atLeast"/>
+        <w:spacing w:before="0" w:beforeAutospacing="1" w:after="40" w:afterAutospacing="1" w:line="240" w:lineRule="auto"/>
         <w:rPr>
           <w:rFonts w:ascii="Onest" w:eastAsia="Times New Roman" w:hAnsi="Onest" w:cs="Segoe UI"/>
           <w:kern w:val="0"/>
@@ -520,7 +330,7 @@
           <w:ilvl w:val="0"/>
           <w:numId w:val="2"/>
         </w:numPr>
-        <w:spacing w:before="100" w:beforeAutospacing="1" w:after="100" w:afterAutospacing="1" w:line="300" w:lineRule="atLeast"/>
+        <w:spacing w:before="0" w:beforeAutospacing="1" w:after="40" w:afterAutospacing="1" w:line="240" w:lineRule="auto"/>
         <w:rPr>
           <w:rFonts w:ascii="Onest" w:eastAsia="Times New Roman" w:hAnsi="Onest" w:cs="Segoe UI"/>
           <w:kern w:val="0"/>
@@ -586,7 +396,7 @@
           <w:ilvl w:val="0"/>
           <w:numId w:val="2"/>
         </w:numPr>
-        <w:spacing w:before="100" w:beforeAutospacing="1" w:after="100" w:afterAutospacing="1" w:line="300" w:lineRule="atLeast"/>
+        <w:spacing w:before="0" w:beforeAutospacing="1" w:after="40" w:afterAutospacing="1" w:line="240" w:lineRule="auto"/>
         <w:rPr>
           <w:rFonts w:ascii="Onest" w:eastAsia="Times New Roman" w:hAnsi="Onest" w:cs="Segoe UI"/>
           <w:kern w:val="0"/>
@@ -632,24 +442,24 @@
           <w:ilvl w:val="0"/>
           <w:numId w:val="2"/>
         </w:numPr>
-        <w:spacing w:before="100" w:beforeAutospacing="1" w:after="100" w:afterAutospacing="1" w:line="300" w:lineRule="atLeast"/>
-        <w:rPr>
-          <w:rFonts w:ascii="Onest" w:eastAsia="Times New Roman" w:hAnsi="Onest" w:cs="Segoe UI"/>
-          <w:kern w:val="0"/>
-          <w:sz w:val="21"/>
-          <w:szCs w:val="21"/>
-          <w14:ligatures w14:val="none"/>
-        </w:rPr>
-      </w:pPr>
-      <w:r>
-        <w:rPr>
-          <w:rFonts w:ascii="Onest" w:eastAsia="Times New Roman" w:hAnsi="Onest" w:cs="Segoe UI"/>
-          <w:kern w:val="0"/>
-          <w:sz w:val="21"/>
-          <w:szCs w:val="21"/>
-          <w14:ligatures w14:val="none"/>
-        </w:rPr>
-        <w:t>Understand real-time control concepts</w:t>
+        <w:spacing w:before="0" w:beforeAutospacing="1" w:after="40" w:afterAutospacing="1" w:line="240" w:lineRule="auto"/>
+        <w:rPr>
+          <w:rFonts w:ascii="Onest" w:eastAsia="Times New Roman" w:hAnsi="Onest" w:cs="Segoe UI"/>
+          <w:kern w:val="0"/>
+          <w:sz w:val="21"/>
+          <w:szCs w:val="21"/>
+          <w14:ligatures w14:val="none"/>
+        </w:rPr>
+      </w:pPr>
+      <w:r>
+        <w:rPr>
+          <w:rFonts w:ascii="Onest" w:eastAsia="Times New Roman" w:hAnsi="Onest" w:cs="Segoe UI"/>
+          <w:kern w:val="0"/>
+          <w:sz w:val="21"/>
+          <w:szCs w:val="21"/>
+          <w14:ligatures w14:val="none"/>
+        </w:rPr>
+        <w:t>Understand periodic control loops and how QNX supports real-time systems</w:t>
       </w:r>
     </w:p>
     <w:p>
@@ -658,7 +468,7 @@
           <w:ilvl w:val="0"/>
           <w:numId w:val="2"/>
         </w:numPr>
-        <w:spacing w:before="100" w:beforeAutospacing="1" w:after="100" w:afterAutospacing="1" w:line="300" w:lineRule="atLeast"/>
+        <w:spacing w:before="0" w:beforeAutospacing="1" w:after="40" w:afterAutospacing="1" w:line="240" w:lineRule="auto"/>
         <w:rPr>
           <w:rFonts w:ascii="Onest" w:eastAsia="Times New Roman" w:hAnsi="Onest" w:cs="Segoe UI"/>
           <w:kern w:val="0"/>
@@ -681,6 +491,7 @@
     </w:p>
     <w:p>
       <w:pPr>
+        <w:pageBreakBefore/>
         <w:spacing w:before="100" w:beforeAutospacing="1" w:after="100" w:afterAutospacing="1" w:line="300" w:lineRule="atLeast"/>
         <w:outlineLvl w:val="1"/>
         <w:rPr>
@@ -1870,7 +1681,7 @@
           <w:szCs w:val="21"/>
           <w14:ligatures w14:val="none"/>
         </w:rPr>
-        <w:t xml:space="preserve">two </w:t>
+        <w:t xml:space="preserve">three </w:t>
       </w:r>
       <w:r>
         <w:rPr>
@@ -1890,7 +1701,7 @@
           <w:szCs w:val="21"/>
           <w14:ligatures w14:val="none"/>
         </w:rPr>
-        <w:t xml:space="preserve">nodes to communicate between the gamepad and the arm. If the student </w:t>
+        <w:t xml:space="preserve">nodes for gamepad input, inverse kinematics, and arm control. If the student </w:t>
       </w:r>
       <w:r>
         <w:rPr>
@@ -2017,6 +1828,7 @@
     </w:p>
     <w:p>
       <w:pPr>
+        <w:keepNext/>
         <w:spacing w:before="100" w:beforeAutospacing="1" w:after="100" w:afterAutospacing="1" w:line="300" w:lineRule="atLeast"/>
         <w:outlineLvl w:val="1"/>
         <w:rPr>
@@ -2116,17 +1928,7 @@
           <w:szCs w:val="21"/>
           <w14:ligatures w14:val="none"/>
         </w:rPr>
-        <w:t>Raspberry Pi 5</w:t>
-      </w:r>
-      <w:r>
-        <w:rPr>
-          <w:rFonts w:ascii="Onest" w:eastAsia="Times New Roman" w:hAnsi="Onest" w:cs="Segoe UI"/>
-          <w:kern w:val="0"/>
-          <w:sz w:val="21"/>
-          <w:szCs w:val="21"/>
-          <w14:ligatures w14:val="none"/>
-        </w:rPr>
-        <w:t xml:space="preserve"> (8GB RAM and 32GB micro-SD suggested minimums)</w:t>
+        <w:t>Raspberry Pi 4B or Raspberry Pi 5</w:t>
       </w:r>
     </w:p>
     <w:p>
@@ -2152,27 +1954,7 @@
           <w:szCs w:val="21"/>
           <w14:ligatures w14:val="none"/>
         </w:rPr>
-        <w:t xml:space="preserve">6-DOF </w:t>
-      </w:r>
-      <w:r>
-        <w:rPr>
-          <w:rFonts w:ascii="Onest" w:eastAsia="Times New Roman" w:hAnsi="Onest" w:cs="Segoe UI"/>
-          <w:kern w:val="0"/>
-          <w:sz w:val="21"/>
-          <w:szCs w:val="21"/>
-          <w14:ligatures w14:val="none"/>
-        </w:rPr>
-        <w:t xml:space="preserve">3D-printed </w:t>
-      </w:r>
-      <w:r>
-        <w:rPr>
-          <w:rFonts w:ascii="Onest" w:eastAsia="Times New Roman" w:hAnsi="Onest" w:cs="Segoe UI"/>
-          <w:kern w:val="0"/>
-          <w:sz w:val="21"/>
-          <w:szCs w:val="21"/>
-          <w14:ligatures w14:val="none"/>
-        </w:rPr>
-        <w:t>robotic arm kit</w:t>
+        <w:t>5-DOF 3D-printed robotic arm kit with a separate gripper</w:t>
       </w:r>
     </w:p>
     <w:p>
@@ -2234,7 +2016,7 @@
           <w:szCs w:val="21"/>
           <w14:ligatures w14:val="none"/>
         </w:rPr>
-        <w:t>USB or Bluetooth gamepad (Xbox/PS-style)</w:t>
+        <w:t>Logitech F310 or F710 gamepad in XInput or DirectInput mode; validate captured reports from the exact controller and QNX HIDDI stack before enabling servo power</w:t>
       </w:r>
     </w:p>
     <w:p>
@@ -2296,7 +2078,7 @@
           <w:szCs w:val="21"/>
           <w14:ligatures w14:val="none"/>
         </w:rPr>
-        <w:t>Six servos (3 x MG996R, 3 x SG90)</w:t>
+        <w:t>Six servos: three 270-degree high-torque servos for joints 0-2 and three 180-degree micro servos for joints 3-5, including the gripper</w:t>
       </w:r>
     </w:p>
     <w:p>
@@ -2322,7 +2104,7 @@
           <w:szCs w:val="21"/>
           <w14:ligatures w14:val="none"/>
         </w:rPr>
-        <w:t>Wiring + breadboard</w:t>
+        <w:t>Wiring, a guarded workspace, a physical emergency stop, a normally-off PCA9685 OE or servo-power watchdog, and a verified physical wrist-channel order</w:t>
       </w:r>
     </w:p>
     <w:p>
@@ -2672,63 +2454,84 @@
           <w14:ligatures w14:val="none"/>
         </w:rPr>
       </w:pPr>
-      <w:hyperlink r:id="rId10" w:history="1">
-        <w:r>
-          <w:rPr>
-            <w:rStyle w:val="Hyperlink"/>
-            <w:rFonts w:ascii="Onest" w:eastAsia="Times New Roman" w:hAnsi="Onest" w:cs="Segoe UI"/>
-            <w:kern w:val="0"/>
-            <w:sz w:val="21"/>
-            <w:szCs w:val="21"/>
-            <w14:ligatures w14:val="none"/>
-          </w:rPr>
-          <w:t>ROS2</w:t>
-        </w:r>
-        <w:r>
-          <w:rPr>
-            <w:rStyle w:val="Hyperlink"/>
-            <w:rFonts w:ascii="Onest" w:eastAsia="Times New Roman" w:hAnsi="Onest" w:cs="Segoe UI"/>
-            <w:kern w:val="0"/>
-            <w:sz w:val="21"/>
-            <w:szCs w:val="21"/>
-            <w14:ligatures w14:val="none"/>
-          </w:rPr>
-          <w:t xml:space="preserve"> Humble</w:t>
-        </w:r>
-      </w:hyperlink>
-      <w:r>
-        <w:rPr>
-          <w:rFonts w:ascii="Onest" w:eastAsia="Times New Roman" w:hAnsi="Onest" w:cs="Segoe UI"/>
-          <w:kern w:val="0"/>
-          <w:sz w:val="21"/>
-          <w:szCs w:val="21"/>
-          <w14:ligatures w14:val="none"/>
-        </w:rPr>
-        <w:t xml:space="preserve"> (need to download </w:t>
-      </w:r>
-      <w:r>
-        <w:rPr>
-          <w:rFonts w:ascii="Onest" w:eastAsia="Times New Roman" w:hAnsi="Onest" w:cs="Segoe UI"/>
-          <w:kern w:val="0"/>
-          <w:sz w:val="21"/>
-          <w:szCs w:val="21"/>
-          <w14:ligatures w14:val="none"/>
-        </w:rPr>
-        <w:t xml:space="preserve">and install on the Raspberry Pi the </w:t>
-      </w:r>
-      <w:r>
-        <w:rPr>
-          <w:rFonts w:ascii="Onest" w:eastAsia="Times New Roman" w:hAnsi="Onest" w:cs="Segoe UI"/>
-          <w:kern w:val="0"/>
-          <w:sz w:val="21"/>
-          <w:szCs w:val="21"/>
-          <w14:ligatures w14:val="none"/>
-        </w:rPr>
-        <w:t>QNX-specific port at the link provided)</w:t>
-      </w:r>
-    </w:p>
-    <w:p>
-      <w:pPr>
+      <w:r>
+        <w:rPr>
+          <w:rFonts w:ascii="Onest" w:eastAsia="Times New Roman" w:hAnsi="Onest" w:cs="Segoe UI"/>
+          <w:kern w:val="0"/>
+          <w:sz w:val="21"/>
+          <w:szCs w:val="21"/>
+          <w14:ligatures w14:val="none"/>
+        </w:rPr>
+        <w:t>ROS2 Jazzy for QNX aarch64le, installed under /opt/ros/jazzy</w:t>
+      </w:r>
+    </w:p>
+    <w:p>
+      <w:pPr>
+        <w:numPr>
+          <w:ilvl w:val="0"/>
+          <w:numId w:val="7"/>
+        </w:numPr>
+        <w:spacing w:before="100" w:beforeAutospacing="1" w:after="100" w:afterAutospacing="1" w:line="300" w:lineRule="atLeast"/>
+        <w:rPr>
+          <w:rFonts w:ascii="Onest" w:eastAsia="Times New Roman" w:hAnsi="Onest" w:cs="Segoe UI"/>
+          <w:kern w:val="0"/>
+          <w:sz w:val="21"/>
+          <w:szCs w:val="21"/>
+          <w14:ligatures w14:val="none"/>
+        </w:rPr>
+      </w:pPr>
+      <w:r>
+        <w:t>Python runtime modules: rclpy and smbus</w:t>
+      </w:r>
+    </w:p>
+    <w:p>
+      <w:pPr>
+        <w:numPr>
+          <w:ilvl w:val="0"/>
+          <w:numId w:val="7"/>
+        </w:numPr>
+        <w:spacing w:before="100" w:beforeAutospacing="1" w:after="100" w:afterAutospacing="1" w:line="300" w:lineRule="atLeast"/>
+        <w:rPr>
+          <w:rFonts w:ascii="Onest" w:eastAsia="Times New Roman" w:hAnsi="Onest" w:cs="Segoe UI"/>
+          <w:kern w:val="0"/>
+          <w:sz w:val="21"/>
+          <w:szCs w:val="21"/>
+          <w14:ligatures w14:val="none"/>
+        </w:rPr>
+      </w:pPr>
+      <w:r>
+        <w:t>C++ and ROS dependencies: rclcpp, sensor_msgs, std_msgs, builtin_interfaces, rcl_interfaces, ament_index_cpp, URDF/KDL, kdl_parser, Eigen3, TinyXML2, the QNX HIDDI library, and Screen development headers</w:t>
+      </w:r>
+    </w:p>
+    <w:p>
+      <w:pPr>
+        <w:numPr>
+          <w:ilvl w:val="0"/>
+          <w:numId w:val="7"/>
+        </w:numPr>
+        <w:spacing w:before="100" w:beforeAutospacing="1" w:after="100" w:afterAutospacing="1" w:line="300" w:lineRule="atLeast"/>
+        <w:rPr>
+          <w:rFonts w:ascii="Onest" w:eastAsia="Times New Roman" w:hAnsi="Onest" w:cs="Segoe UI"/>
+          <w:kern w:val="0"/>
+          <w:sz w:val="21"/>
+          <w:szCs w:val="21"/>
+          <w14:ligatures w14:val="none"/>
+        </w:rPr>
+      </w:pPr>
+      <w:r>
+        <w:rPr>
+          <w:rFonts w:ascii="Onest" w:eastAsia="Times New Roman" w:hAnsi="Onest" w:cs="Segoe UI"/>
+          <w:kern w:val="0"/>
+          <w:sz w:val="21"/>
+          <w:szCs w:val="21"/>
+          <w14:ligatures w14:val="none"/>
+        </w:rPr>
+        <w:t>A dedicated unprivileged service account with only the required HIDDI and I2C permissions; a root-owned promoted install; and deny-by-default SROS2 identities for each active node</w:t>
+      </w:r>
+    </w:p>
+    <w:p>
+      <w:pPr>
+        <w:keepNext/>
         <w:spacing w:before="100" w:beforeAutospacing="1" w:after="100" w:afterAutospacing="1" w:line="300" w:lineRule="atLeast"/>
         <w:outlineLvl w:val="1"/>
         <w:rPr>
@@ -2756,6 +2559,7 @@
     </w:p>
     <w:p>
       <w:pPr>
+        <w:keepNext/>
         <w:spacing w:before="100" w:beforeAutospacing="1" w:after="100" w:afterAutospacing="1" w:line="300" w:lineRule="atLeast"/>
         <w:rPr>
           <w:rFonts w:ascii="Onest" w:eastAsia="Times New Roman" w:hAnsi="Onest" w:cs="Segoe UI"/>
@@ -2773,11 +2577,12 @@
           <w:szCs w:val="21"/>
           <w14:ligatures w14:val="none"/>
         </w:rPr>
-        <w:t>The system has two main software components:</w:t>
-      </w:r>
-    </w:p>
-    <w:p>
-      <w:pPr>
+        <w:t>The repository contains three ROS2 nodes. The secured default launch runs the gamepad and arm-controller nodes with autonomous demonstrations disabled; inverse kinematics is experimental and opt-in:</w:t>
+      </w:r>
+    </w:p>
+    <w:p>
+      <w:pPr>
+        <w:keepNext/>
         <w:numPr>
           <w:ilvl w:val="0"/>
           <w:numId w:val="8"/>
@@ -2806,6 +2611,7 @@
     </w:p>
     <w:p>
       <w:pPr>
+        <w:keepNext/>
         <w:numPr>
           <w:ilvl w:val="1"/>
           <w:numId w:val="8"/>
@@ -2827,7 +2633,7 @@
           <w:szCs w:val="21"/>
           <w14:ligatures w14:val="none"/>
         </w:rPr>
-        <w:t>Reads controller input</w:t>
+        <w:t>Accepts only length- and framing-validated Logitech F310/F710 gamepad reports through QNX HIDDI and attaches exclusively to one active device</w:t>
       </w:r>
     </w:p>
     <w:p>
@@ -2853,27 +2659,7 @@
           <w:szCs w:val="21"/>
           <w14:ligatures w14:val="none"/>
         </w:rPr>
-        <w:t xml:space="preserve">Publishes </w:t>
-      </w:r>
-      <w:r>
-        <w:rPr>
-          <w:rFonts w:ascii="Onest" w:eastAsia="Times New Roman" w:hAnsi="Onest" w:cs="Courier New"/>
-          <w:kern w:val="0"/>
-          <w:sz w:val="20"/>
-          <w:szCs w:val="20"/>
-          <w14:ligatures w14:val="none"/>
-        </w:rPr>
-        <w:t>/joy</w:t>
-      </w:r>
-      <w:r>
-        <w:rPr>
-          <w:rFonts w:ascii="Onest" w:eastAsia="Times New Roman" w:hAnsi="Onest" w:cs="Segoe UI"/>
-          <w:kern w:val="0"/>
-          <w:sz w:val="21"/>
-          <w:szCs w:val="21"/>
-          <w14:ligatures w14:val="none"/>
-        </w:rPr>
-        <w:t xml:space="preserve"> messages</w:t>
+        <w:t>Publishes relative joy messages at up to 50 Hz; controller loss, an invalid report, or a 250 ms timeout sends a final neutral and exits nonzero so supervision stops the control unit</w:t>
       </w:r>
     </w:p>
     <w:p>
@@ -2927,27 +2713,7 @@
           <w:szCs w:val="21"/>
           <w14:ligatures w14:val="none"/>
         </w:rPr>
-        <w:t xml:space="preserve">Receives </w:t>
-      </w:r>
-      <w:r>
-        <w:rPr>
-          <w:rFonts w:ascii="Onest" w:eastAsia="Times New Roman" w:hAnsi="Onest" w:cs="Courier New"/>
-          <w:kern w:val="0"/>
-          <w:sz w:val="20"/>
-          <w:szCs w:val="20"/>
-          <w14:ligatures w14:val="none"/>
-        </w:rPr>
-        <w:t>/joy</w:t>
-      </w:r>
-      <w:r>
-        <w:rPr>
-          <w:rFonts w:ascii="Onest" w:eastAsia="Times New Roman" w:hAnsi="Onest" w:cs="Segoe UI"/>
-          <w:kern w:val="0"/>
-          <w:sz w:val="21"/>
-          <w:szCs w:val="21"/>
-          <w14:ligatures w14:val="none"/>
-        </w:rPr>
-        <w:t xml:space="preserve"> messages</w:t>
+        <w:t>Starts disarmed and accepts bounded, finite, fresh commands only while L3 is held; production arming requires a bound hardware OE or servo-power hook</w:t>
       </w:r>
     </w:p>
     <w:p>
@@ -2973,7 +2739,139 @@
           <w:szCs w:val="21"/>
           <w14:ligatures w14:val="none"/>
         </w:rPr>
-        <w:t>Converts input into servo motion commands</w:t>
+        <w:t>After hardware-hook integration, hold L3 and press the exact neutral SELECT+START+A chord to arm; releasing L3 disables output, and calibrated limits and slew bounds remain active</w:t>
+      </w:r>
+    </w:p>
+    <w:p>
+      <w:pPr>
+        <w:numPr>
+          <w:ilvl w:val="1"/>
+          <w:numId w:val="8"/>
+        </w:numPr>
+        <w:spacing w:before="100" w:beforeAutospacing="1" w:after="100" w:afterAutospacing="1" w:line="300" w:lineRule="atLeast"/>
+        <w:rPr>
+          <w:rFonts w:ascii="Onest" w:eastAsia="Times New Roman" w:hAnsi="Onest" w:cs="Segoe UI"/>
+          <w:kern w:val="0"/>
+          <w:sz w:val="21"/>
+          <w:szCs w:val="21"/>
+          <w14:ligatures w14:val="none"/>
+        </w:rPr>
+      </w:pPr>
+      <w:r>
+        <w:rPr>
+          <w:rFonts w:ascii="Onest" w:eastAsia="Times New Roman" w:hAnsi="Onest" w:cs="Segoe UI"/>
+          <w:kern w:val="0"/>
+          <w:sz w:val="21"/>
+          <w:szCs w:val="21"/>
+          <w14:ligatures w14:val="none"/>
+        </w:rPr>
+        <w:t>Inside a per-robot SROS2 namespace, IK topics are relative; CurrentPositions and CartesianCmd carry a bounded session epoch, but CurrentPositions is a commanded open-loop estimate, not measured feedback</w:t>
+      </w:r>
+    </w:p>
+    <w:p>
+      <w:pPr>
+        <w:numPr>
+          <w:ilvl w:val="0"/>
+          <w:numId w:val="8"/>
+        </w:numPr>
+        <w:spacing w:before="100" w:beforeAutospacing="1" w:after="100" w:afterAutospacing="1" w:line="300" w:lineRule="atLeast"/>
+        <w:rPr>
+          <w:rFonts w:ascii="Onest" w:eastAsia="Times New Roman" w:hAnsi="Onest" w:cs="Segoe UI"/>
+          <w:kern w:val="0"/>
+          <w:sz w:val="21"/>
+          <w:szCs w:val="21"/>
+          <w14:ligatures w14:val="none"/>
+        </w:rPr>
+      </w:pPr>
+      <w:r>
+        <w:rPr>
+          <w:rFonts w:ascii="Onest" w:eastAsia="Times New Roman" w:hAnsi="Onest" w:cs="Segoe UI"/>
+          <w:b/>
+          <w:bCs/>
+          <w:kern w:val="0"/>
+          <w:sz w:val="21"/>
+          <w:szCs w:val="21"/>
+          <w14:ligatures w14:val="none"/>
+        </w:rPr>
+        <w:t>Inverse Kinematics Solver (C++)</w:t>
+      </w:r>
+    </w:p>
+    <w:p>
+      <w:pPr>
+        <w:numPr>
+          <w:ilvl w:val="1"/>
+          <w:numId w:val="8"/>
+        </w:numPr>
+        <w:spacing w:before="100" w:beforeAutospacing="1" w:after="100" w:afterAutospacing="1" w:line="300" w:lineRule="atLeast"/>
+        <w:rPr>
+          <w:rFonts w:ascii="Onest" w:eastAsia="Times New Roman" w:hAnsi="Onest" w:cs="Segoe UI"/>
+          <w:kern w:val="0"/>
+          <w:sz w:val="21"/>
+          <w:szCs w:val="21"/>
+          <w14:ligatures w14:val="none"/>
+        </w:rPr>
+      </w:pPr>
+      <w:r>
+        <w:rPr>
+          <w:rFonts w:ascii="Onest" w:eastAsia="Times New Roman" w:hAnsi="Onest" w:cs="Segoe UI"/>
+          <w:kern w:val="0"/>
+          <w:sz w:val="21"/>
+          <w:szCs w:val="21"/>
+          <w14:ligatures w14:val="none"/>
+        </w:rPr>
+        <w:t>Uses Orocos KDL LMA only after a confined model passes an exact five-joint, bounded-chain validation contract</w:t>
+      </w:r>
+    </w:p>
+    <w:p>
+      <w:pPr>
+        <w:numPr>
+          <w:ilvl w:val="1"/>
+          <w:numId w:val="8"/>
+        </w:numPr>
+        <w:spacing w:before="100" w:beforeAutospacing="1" w:after="100" w:afterAutospacing="1" w:line="300" w:lineRule="atLeast"/>
+        <w:rPr>
+          <w:rFonts w:ascii="Onest" w:eastAsia="Times New Roman" w:hAnsi="Onest" w:cs="Segoe UI"/>
+          <w:kern w:val="0"/>
+          <w:sz w:val="21"/>
+          <w:szCs w:val="21"/>
+          <w14:ligatures w14:val="none"/>
+        </w:rPr>
+      </w:pPr>
+      <w:r>
+        <w:rPr>
+          <w:rFonts w:ascii="Onest" w:eastAsia="Times New Roman" w:hAnsi="Onest" w:cs="Segoe UI"/>
+          <w:kern w:val="0"/>
+          <w:sz w:val="21"/>
+          <w:szCs w:val="21"/>
+          <w14:ligatures w14:val="none"/>
+        </w:rPr>
+        <w:t>Rejects malformed/non-finite inputs, mismatched or stale session epochs, excessive callback gaps, and discontinuous solutions before publishing exact, ordered five-joint commands tagged to that epoch on relative mov</w:t>
+      </w:r>
+    </w:p>
+    <w:p>
+      <w:pPr>
+        <w:numPr>
+          <w:ilvl w:val="1"/>
+          <w:numId w:val="8"/>
+        </w:numPr>
+        <w:spacing w:before="100" w:beforeAutospacing="1" w:after="100" w:afterAutospacing="1" w:line="300" w:lineRule="atLeast"/>
+        <w:rPr>
+          <w:rFonts w:ascii="Onest" w:eastAsia="Times New Roman" w:hAnsi="Onest" w:cs="Segoe UI"/>
+          <w:kern w:val="0"/>
+          <w:sz w:val="21"/>
+          <w:szCs w:val="21"/>
+          <w14:ligatures w14:val="none"/>
+        </w:rPr>
+      </w:pPr>
+      <w:r>
+        <w:rPr>
+          <w:rFonts w:ascii="Onest" w:eastAsia="Times New Roman" w:hAnsi="Onest" w:cs="Segoe UI"/>
+          <w:kern w:val="0"/>
+          <w:sz w:val="21"/>
+          <w:szCs w:val="21"/>
+          <w14:ligatures w14:val="none"/>
+        </w:rPr>
+        <w:t>The checked-in URDF intentionally fails validation. Keep IK disabled until a measured five-joint model, tool-center point, collision checks, and verified homing or position feedback are supplied</w:t>
       </w:r>
     </w:p>
     <w:p>
@@ -3408,7 +3306,9 @@
     </w:p>
     <w:p>
       <w:pPr>
-        <w:spacing w:before="100" w:beforeAutospacing="1" w:after="100" w:afterAutospacing="1" w:line="300" w:lineRule="atLeast"/>
+        <w:keepNext/>
+        <w:keepLines/>
+        <w:spacing w:before="0" w:after="40" w:line="240" w:lineRule="auto"/>
         <w:outlineLvl w:val="1"/>
         <w:rPr>
           <w:rFonts w:ascii="Onest" w:eastAsia="Times New Roman" w:hAnsi="Onest" w:cs="Segoe UI"/>
@@ -3435,7 +3335,9 @@
     </w:p>
     <w:p>
       <w:pPr>
-        <w:spacing w:before="100" w:beforeAutospacing="1" w:after="100" w:afterAutospacing="1" w:line="300" w:lineRule="atLeast"/>
+        <w:keepNext/>
+        <w:keepLines/>
+        <w:spacing w:before="0" w:after="40" w:line="240" w:lineRule="auto"/>
         <w:outlineLvl w:val="2"/>
         <w:rPr>
           <w:rFonts w:ascii="Onest" w:eastAsia="Times New Roman" w:hAnsi="Onest" w:cs="Segoe UI"/>
@@ -3462,24 +3364,26 @@
     </w:p>
     <w:p>
       <w:pPr>
+        <w:keepNext/>
+        <w:keepLines/>
         <w:numPr>
           <w:ilvl w:val="0"/>
           <w:numId w:val="9"/>
         </w:numPr>
-        <w:spacing w:before="100" w:beforeAutospacing="1" w:after="100" w:afterAutospacing="1" w:line="300" w:lineRule="atLeast"/>
-        <w:rPr>
-          <w:rFonts w:ascii="Onest" w:eastAsia="Times New Roman" w:hAnsi="Onest" w:cs="Segoe UI"/>
-          <w:kern w:val="0"/>
-          <w:sz w:val="21"/>
-          <w:szCs w:val="21"/>
-          <w14:ligatures w14:val="none"/>
-        </w:rPr>
-      </w:pPr>
-      <w:r>
-        <w:rPr>
-          <w:rFonts w:ascii="Onest" w:eastAsia="Times New Roman" w:hAnsi="Onest" w:cs="Segoe UI"/>
-          <w:kern w:val="0"/>
-          <w:sz w:val="21"/>
+        <w:spacing w:before="0" w:after="40" w:line="240" w:lineRule="auto"/>
+        <w:rPr>
+          <w:rFonts w:ascii="Onest" w:eastAsia="Times New Roman" w:hAnsi="Onest" w:cs="Segoe UI"/>
+          <w:kern w:val="0"/>
+          <w:sz w:val="21"/>
+          <w:szCs w:val="21"/>
+          <w14:ligatures w14:val="none"/>
+        </w:rPr>
+      </w:pPr>
+      <w:r>
+        <w:rPr>
+          <w:rFonts w:ascii="Onest" w:eastAsia="Times New Roman" w:hAnsi="Onest" w:cs="Segoe UI"/>
+          <w:kern w:val="0"/>
+          <w:sz w:val="20"/>
           <w:szCs w:val="21"/>
           <w14:ligatures w14:val="none"/>
         </w:rPr>
@@ -3488,24 +3392,26 @@
     </w:p>
     <w:p>
       <w:pPr>
+        <w:keepNext/>
+        <w:keepLines/>
         <w:numPr>
           <w:ilvl w:val="0"/>
           <w:numId w:val="9"/>
         </w:numPr>
-        <w:spacing w:before="100" w:beforeAutospacing="1" w:after="100" w:afterAutospacing="1" w:line="300" w:lineRule="atLeast"/>
-        <w:rPr>
-          <w:rFonts w:ascii="Onest" w:eastAsia="Times New Roman" w:hAnsi="Onest" w:cs="Segoe UI"/>
-          <w:kern w:val="0"/>
-          <w:sz w:val="21"/>
-          <w:szCs w:val="21"/>
-          <w14:ligatures w14:val="none"/>
-        </w:rPr>
-      </w:pPr>
-      <w:r>
-        <w:rPr>
-          <w:rFonts w:ascii="Onest" w:eastAsia="Times New Roman" w:hAnsi="Onest" w:cs="Segoe UI"/>
-          <w:kern w:val="0"/>
-          <w:sz w:val="21"/>
+        <w:spacing w:before="0" w:after="40" w:line="240" w:lineRule="auto"/>
+        <w:rPr>
+          <w:rFonts w:ascii="Onest" w:eastAsia="Times New Roman" w:hAnsi="Onest" w:cs="Segoe UI"/>
+          <w:kern w:val="0"/>
+          <w:sz w:val="21"/>
+          <w:szCs w:val="21"/>
+          <w14:ligatures w14:val="none"/>
+        </w:rPr>
+      </w:pPr>
+      <w:r>
+        <w:rPr>
+          <w:rFonts w:ascii="Onest" w:eastAsia="Times New Roman" w:hAnsi="Onest" w:cs="Segoe UI"/>
+          <w:kern w:val="0"/>
+          <w:sz w:val="20"/>
           <w:szCs w:val="21"/>
           <w14:ligatures w14:val="none"/>
         </w:rPr>
@@ -3514,24 +3420,26 @@
     </w:p>
     <w:p>
       <w:pPr>
+        <w:keepNext/>
+        <w:keepLines/>
         <w:numPr>
           <w:ilvl w:val="0"/>
           <w:numId w:val="9"/>
         </w:numPr>
-        <w:spacing w:before="100" w:beforeAutospacing="1" w:after="100" w:afterAutospacing="1" w:line="300" w:lineRule="atLeast"/>
-        <w:rPr>
-          <w:rFonts w:ascii="Onest" w:eastAsia="Times New Roman" w:hAnsi="Onest" w:cs="Segoe UI"/>
-          <w:kern w:val="0"/>
-          <w:sz w:val="21"/>
-          <w:szCs w:val="21"/>
-          <w14:ligatures w14:val="none"/>
-        </w:rPr>
-      </w:pPr>
-      <w:r>
-        <w:rPr>
-          <w:rFonts w:ascii="Onest" w:eastAsia="Times New Roman" w:hAnsi="Onest" w:cs="Segoe UI"/>
-          <w:kern w:val="0"/>
-          <w:sz w:val="21"/>
+        <w:spacing w:before="0" w:after="40" w:line="240" w:lineRule="auto"/>
+        <w:rPr>
+          <w:rFonts w:ascii="Onest" w:eastAsia="Times New Roman" w:hAnsi="Onest" w:cs="Segoe UI"/>
+          <w:kern w:val="0"/>
+          <w:sz w:val="21"/>
+          <w:szCs w:val="21"/>
+          <w14:ligatures w14:val="none"/>
+        </w:rPr>
+      </w:pPr>
+      <w:r>
+        <w:rPr>
+          <w:rFonts w:ascii="Onest" w:eastAsia="Times New Roman" w:hAnsi="Onest" w:cs="Segoe UI"/>
+          <w:kern w:val="0"/>
+          <w:sz w:val="20"/>
           <w:szCs w:val="21"/>
           <w14:ligatures w14:val="none"/>
         </w:rPr>
@@ -3540,7 +3448,8 @@
     </w:p>
     <w:p>
       <w:pPr>
-        <w:spacing w:before="100" w:beforeAutospacing="1" w:after="100" w:afterAutospacing="1" w:line="300" w:lineRule="atLeast"/>
+        <w:keepLines/>
+        <w:spacing w:before="0" w:after="40" w:line="240" w:lineRule="auto"/>
         <w:outlineLvl w:val="2"/>
         <w:rPr>
           <w:rFonts w:ascii="Onest" w:eastAsia="Times New Roman" w:hAnsi="Onest" w:cs="Segoe UI"/>
@@ -3567,24 +3476,25 @@
     </w:p>
     <w:p>
       <w:pPr>
+        <w:keepLines/>
         <w:numPr>
           <w:ilvl w:val="0"/>
           <w:numId w:val="10"/>
         </w:numPr>
-        <w:spacing w:before="100" w:beforeAutospacing="1" w:after="100" w:afterAutospacing="1" w:line="300" w:lineRule="atLeast"/>
-        <w:rPr>
-          <w:rFonts w:ascii="Onest" w:eastAsia="Times New Roman" w:hAnsi="Onest" w:cs="Segoe UI"/>
-          <w:kern w:val="0"/>
-          <w:sz w:val="21"/>
-          <w:szCs w:val="21"/>
-          <w14:ligatures w14:val="none"/>
-        </w:rPr>
-      </w:pPr>
-      <w:r>
-        <w:rPr>
-          <w:rFonts w:ascii="Onest" w:eastAsia="Times New Roman" w:hAnsi="Onest" w:cs="Segoe UI"/>
-          <w:kern w:val="0"/>
-          <w:sz w:val="21"/>
+        <w:spacing w:before="0" w:after="40" w:line="240" w:lineRule="auto"/>
+        <w:rPr>
+          <w:rFonts w:ascii="Onest" w:eastAsia="Times New Roman" w:hAnsi="Onest" w:cs="Segoe UI"/>
+          <w:kern w:val="0"/>
+          <w:sz w:val="21"/>
+          <w:szCs w:val="21"/>
+          <w14:ligatures w14:val="none"/>
+        </w:rPr>
+      </w:pPr>
+      <w:r>
+        <w:rPr>
+          <w:rFonts w:ascii="Onest" w:eastAsia="Times New Roman" w:hAnsi="Onest" w:cs="Segoe UI"/>
+          <w:kern w:val="0"/>
+          <w:sz w:val="20"/>
           <w:szCs w:val="21"/>
           <w14:ligatures w14:val="none"/>
         </w:rPr>
@@ -3593,24 +3503,25 @@
     </w:p>
     <w:p>
       <w:pPr>
+        <w:keepLines/>
         <w:numPr>
           <w:ilvl w:val="0"/>
           <w:numId w:val="10"/>
         </w:numPr>
-        <w:spacing w:before="100" w:beforeAutospacing="1" w:after="100" w:afterAutospacing="1" w:line="300" w:lineRule="atLeast"/>
-        <w:rPr>
-          <w:rFonts w:ascii="Onest" w:eastAsia="Times New Roman" w:hAnsi="Onest" w:cs="Segoe UI"/>
-          <w:kern w:val="0"/>
-          <w:sz w:val="21"/>
-          <w:szCs w:val="21"/>
-          <w14:ligatures w14:val="none"/>
-        </w:rPr>
-      </w:pPr>
-      <w:r>
-        <w:rPr>
-          <w:rFonts w:ascii="Onest" w:eastAsia="Times New Roman" w:hAnsi="Onest" w:cs="Segoe UI"/>
-          <w:kern w:val="0"/>
-          <w:sz w:val="21"/>
+        <w:spacing w:before="0" w:after="40" w:line="240" w:lineRule="auto"/>
+        <w:rPr>
+          <w:rFonts w:ascii="Onest" w:eastAsia="Times New Roman" w:hAnsi="Onest" w:cs="Segoe UI"/>
+          <w:kern w:val="0"/>
+          <w:sz w:val="21"/>
+          <w:szCs w:val="21"/>
+          <w14:ligatures w14:val="none"/>
+        </w:rPr>
+      </w:pPr>
+      <w:r>
+        <w:rPr>
+          <w:rFonts w:ascii="Onest" w:eastAsia="Times New Roman" w:hAnsi="Onest" w:cs="Segoe UI"/>
+          <w:kern w:val="0"/>
+          <w:sz w:val="20"/>
           <w:szCs w:val="21"/>
           <w14:ligatures w14:val="none"/>
         </w:rPr>
@@ -3619,24 +3530,25 @@
     </w:p>
     <w:p>
       <w:pPr>
+        <w:keepLines/>
         <w:numPr>
           <w:ilvl w:val="0"/>
           <w:numId w:val="10"/>
         </w:numPr>
-        <w:spacing w:before="100" w:beforeAutospacing="1" w:after="100" w:afterAutospacing="1" w:line="300" w:lineRule="atLeast"/>
-        <w:rPr>
-          <w:rFonts w:ascii="Onest" w:eastAsia="Times New Roman" w:hAnsi="Onest" w:cs="Segoe UI"/>
-          <w:kern w:val="0"/>
-          <w:sz w:val="21"/>
-          <w:szCs w:val="21"/>
-          <w14:ligatures w14:val="none"/>
-        </w:rPr>
-      </w:pPr>
-      <w:r>
-        <w:rPr>
-          <w:rFonts w:ascii="Onest" w:eastAsia="Times New Roman" w:hAnsi="Onest" w:cs="Segoe UI"/>
-          <w:kern w:val="0"/>
-          <w:sz w:val="21"/>
+        <w:spacing w:before="0" w:after="40" w:line="240" w:lineRule="auto"/>
+        <w:rPr>
+          <w:rFonts w:ascii="Onest" w:eastAsia="Times New Roman" w:hAnsi="Onest" w:cs="Segoe UI"/>
+          <w:kern w:val="0"/>
+          <w:sz w:val="21"/>
+          <w:szCs w:val="21"/>
+          <w14:ligatures w14:val="none"/>
+        </w:rPr>
+      </w:pPr>
+      <w:r>
+        <w:rPr>
+          <w:rFonts w:ascii="Onest" w:eastAsia="Times New Roman" w:hAnsi="Onest" w:cs="Segoe UI"/>
+          <w:kern w:val="0"/>
+          <w:sz w:val="20"/>
           <w:szCs w:val="21"/>
           <w14:ligatures w14:val="none"/>
         </w:rPr>
@@ -3645,24 +3557,25 @@
     </w:p>
     <w:p>
       <w:pPr>
+        <w:keepLines/>
         <w:numPr>
           <w:ilvl w:val="0"/>
           <w:numId w:val="10"/>
         </w:numPr>
-        <w:spacing w:before="100" w:beforeAutospacing="1" w:after="100" w:afterAutospacing="1" w:line="300" w:lineRule="atLeast"/>
-        <w:rPr>
-          <w:rFonts w:ascii="Onest" w:eastAsia="Times New Roman" w:hAnsi="Onest" w:cs="Segoe UI"/>
-          <w:kern w:val="0"/>
-          <w:sz w:val="21"/>
-          <w:szCs w:val="21"/>
-          <w14:ligatures w14:val="none"/>
-        </w:rPr>
-      </w:pPr>
-      <w:r>
-        <w:rPr>
-          <w:rFonts w:ascii="Onest" w:eastAsia="Times New Roman" w:hAnsi="Onest" w:cs="Segoe UI"/>
-          <w:kern w:val="0"/>
-          <w:sz w:val="21"/>
+        <w:spacing w:before="0" w:after="40" w:line="240" w:lineRule="auto"/>
+        <w:rPr>
+          <w:rFonts w:ascii="Onest" w:eastAsia="Times New Roman" w:hAnsi="Onest" w:cs="Segoe UI"/>
+          <w:kern w:val="0"/>
+          <w:sz w:val="21"/>
+          <w:szCs w:val="21"/>
+          <w14:ligatures w14:val="none"/>
+        </w:rPr>
+      </w:pPr>
+      <w:r>
+        <w:rPr>
+          <w:rFonts w:ascii="Onest" w:eastAsia="Times New Roman" w:hAnsi="Onest" w:cs="Segoe UI"/>
+          <w:kern w:val="0"/>
+          <w:sz w:val="20"/>
           <w:szCs w:val="21"/>
           <w14:ligatures w14:val="none"/>
         </w:rPr>
@@ -3671,7 +3584,8 @@
     </w:p>
     <w:p>
       <w:pPr>
-        <w:spacing w:before="100" w:beforeAutospacing="1" w:after="100" w:afterAutospacing="1" w:line="300" w:lineRule="atLeast"/>
+        <w:keepLines/>
+        <w:spacing w:before="0" w:after="40" w:line="240" w:lineRule="auto"/>
         <w:outlineLvl w:val="2"/>
         <w:rPr>
           <w:rFonts w:ascii="Onest" w:eastAsia="Times New Roman" w:hAnsi="Onest" w:cs="Segoe UI"/>
@@ -3698,24 +3612,25 @@
     </w:p>
     <w:p>
       <w:pPr>
+        <w:keepLines/>
         <w:numPr>
           <w:ilvl w:val="0"/>
           <w:numId w:val="11"/>
         </w:numPr>
-        <w:spacing w:before="100" w:beforeAutospacing="1" w:after="100" w:afterAutospacing="1" w:line="300" w:lineRule="atLeast"/>
-        <w:rPr>
-          <w:rFonts w:ascii="Onest" w:eastAsia="Times New Roman" w:hAnsi="Onest" w:cs="Segoe UI"/>
-          <w:kern w:val="0"/>
-          <w:sz w:val="21"/>
-          <w:szCs w:val="21"/>
-          <w14:ligatures w14:val="none"/>
-        </w:rPr>
-      </w:pPr>
-      <w:r>
-        <w:rPr>
-          <w:rFonts w:ascii="Onest" w:eastAsia="Times New Roman" w:hAnsi="Onest" w:cs="Segoe UI"/>
-          <w:kern w:val="0"/>
-          <w:sz w:val="21"/>
+        <w:spacing w:before="0" w:after="40" w:line="240" w:lineRule="auto"/>
+        <w:rPr>
+          <w:rFonts w:ascii="Onest" w:eastAsia="Times New Roman" w:hAnsi="Onest" w:cs="Segoe UI"/>
+          <w:kern w:val="0"/>
+          <w:sz w:val="21"/>
+          <w:szCs w:val="21"/>
+          <w14:ligatures w14:val="none"/>
+        </w:rPr>
+      </w:pPr>
+      <w:r>
+        <w:rPr>
+          <w:rFonts w:ascii="Onest" w:eastAsia="Times New Roman" w:hAnsi="Onest" w:cs="Segoe UI"/>
+          <w:kern w:val="0"/>
+          <w:sz w:val="20"/>
           <w:szCs w:val="21"/>
           <w14:ligatures w14:val="none"/>
         </w:rPr>
@@ -3724,24 +3639,25 @@
     </w:p>
     <w:p>
       <w:pPr>
+        <w:keepLines/>
         <w:numPr>
           <w:ilvl w:val="0"/>
           <w:numId w:val="11"/>
         </w:numPr>
-        <w:spacing w:before="100" w:beforeAutospacing="1" w:after="100" w:afterAutospacing="1" w:line="300" w:lineRule="atLeast"/>
-        <w:rPr>
-          <w:rFonts w:ascii="Onest" w:eastAsia="Times New Roman" w:hAnsi="Onest" w:cs="Segoe UI"/>
-          <w:kern w:val="0"/>
-          <w:sz w:val="21"/>
-          <w:szCs w:val="21"/>
-          <w14:ligatures w14:val="none"/>
-        </w:rPr>
-      </w:pPr>
-      <w:r>
-        <w:rPr>
-          <w:rFonts w:ascii="Onest" w:eastAsia="Times New Roman" w:hAnsi="Onest" w:cs="Segoe UI"/>
-          <w:kern w:val="0"/>
-          <w:sz w:val="21"/>
+        <w:spacing w:before="0" w:after="40" w:line="240" w:lineRule="auto"/>
+        <w:rPr>
+          <w:rFonts w:ascii="Onest" w:eastAsia="Times New Roman" w:hAnsi="Onest" w:cs="Segoe UI"/>
+          <w:kern w:val="0"/>
+          <w:sz w:val="21"/>
+          <w:szCs w:val="21"/>
+          <w14:ligatures w14:val="none"/>
+        </w:rPr>
+      </w:pPr>
+      <w:r>
+        <w:rPr>
+          <w:rFonts w:ascii="Onest" w:eastAsia="Times New Roman" w:hAnsi="Onest" w:cs="Segoe UI"/>
+          <w:kern w:val="0"/>
+          <w:sz w:val="20"/>
           <w:szCs w:val="21"/>
           <w14:ligatures w14:val="none"/>
         </w:rPr>
@@ -3750,7 +3666,8 @@
     </w:p>
     <w:p>
       <w:pPr>
-        <w:spacing w:before="100" w:beforeAutospacing="1" w:after="100" w:afterAutospacing="1" w:line="300" w:lineRule="atLeast"/>
+        <w:keepLines/>
+        <w:spacing w:before="0" w:after="40" w:line="240" w:lineRule="auto"/>
         <w:outlineLvl w:val="1"/>
         <w:rPr>
           <w:rFonts w:ascii="Onest" w:eastAsia="Times New Roman" w:hAnsi="Onest" w:cs="Segoe UI"/>
@@ -3777,7 +3694,8 @@
     </w:p>
     <w:p>
       <w:pPr>
-        <w:spacing w:before="100" w:beforeAutospacing="1" w:after="100" w:afterAutospacing="1" w:line="300" w:lineRule="atLeast"/>
+        <w:keepLines/>
+        <w:spacing w:before="0" w:after="40" w:line="240" w:lineRule="auto"/>
         <w:rPr>
           <w:rFonts w:ascii="Onest" w:eastAsia="Times New Roman" w:hAnsi="Onest" w:cs="Segoe UI"/>
           <w:kern w:val="0"/>
@@ -3799,24 +3717,25 @@
     </w:p>
     <w:p>
       <w:pPr>
+        <w:keepLines/>
         <w:numPr>
           <w:ilvl w:val="0"/>
           <w:numId w:val="12"/>
         </w:numPr>
-        <w:spacing w:before="100" w:beforeAutospacing="1" w:after="100" w:afterAutospacing="1" w:line="300" w:lineRule="atLeast"/>
-        <w:rPr>
-          <w:rFonts w:ascii="Onest" w:eastAsia="Times New Roman" w:hAnsi="Onest" w:cs="Segoe UI"/>
-          <w:kern w:val="0"/>
-          <w:sz w:val="21"/>
-          <w:szCs w:val="21"/>
-          <w14:ligatures w14:val="none"/>
-        </w:rPr>
-      </w:pPr>
-      <w:r>
-        <w:rPr>
-          <w:rFonts w:ascii="Onest" w:eastAsia="Times New Roman" w:hAnsi="Onest" w:cs="Segoe UI"/>
-          <w:kern w:val="0"/>
-          <w:sz w:val="21"/>
+        <w:spacing w:before="0" w:after="40" w:line="240" w:lineRule="auto"/>
+        <w:rPr>
+          <w:rFonts w:ascii="Onest" w:eastAsia="Times New Roman" w:hAnsi="Onest" w:cs="Segoe UI"/>
+          <w:kern w:val="0"/>
+          <w:sz w:val="21"/>
+          <w:szCs w:val="21"/>
+          <w14:ligatures w14:val="none"/>
+        </w:rPr>
+      </w:pPr>
+      <w:r>
+        <w:rPr>
+          <w:rFonts w:ascii="Onest" w:eastAsia="Times New Roman" w:hAnsi="Onest" w:cs="Segoe UI"/>
+          <w:kern w:val="0"/>
+          <w:sz w:val="20"/>
           <w:szCs w:val="21"/>
           <w14:ligatures w14:val="none"/>
         </w:rPr>
@@ -3825,24 +3744,25 @@
     </w:p>
     <w:p>
       <w:pPr>
+        <w:keepLines/>
         <w:numPr>
           <w:ilvl w:val="0"/>
           <w:numId w:val="12"/>
         </w:numPr>
-        <w:spacing w:before="100" w:beforeAutospacing="1" w:after="100" w:afterAutospacing="1" w:line="300" w:lineRule="atLeast"/>
-        <w:rPr>
-          <w:rFonts w:ascii="Onest" w:eastAsia="Times New Roman" w:hAnsi="Onest" w:cs="Segoe UI"/>
-          <w:kern w:val="0"/>
-          <w:sz w:val="21"/>
-          <w:szCs w:val="21"/>
-          <w14:ligatures w14:val="none"/>
-        </w:rPr>
-      </w:pPr>
-      <w:r>
-        <w:rPr>
-          <w:rFonts w:ascii="Onest" w:eastAsia="Times New Roman" w:hAnsi="Onest" w:cs="Segoe UI"/>
-          <w:kern w:val="0"/>
-          <w:sz w:val="21"/>
+        <w:spacing w:before="0" w:after="40" w:line="240" w:lineRule="auto"/>
+        <w:rPr>
+          <w:rFonts w:ascii="Onest" w:eastAsia="Times New Roman" w:hAnsi="Onest" w:cs="Segoe UI"/>
+          <w:kern w:val="0"/>
+          <w:sz w:val="21"/>
+          <w:szCs w:val="21"/>
+          <w14:ligatures w14:val="none"/>
+        </w:rPr>
+      </w:pPr>
+      <w:r>
+        <w:rPr>
+          <w:rFonts w:ascii="Onest" w:eastAsia="Times New Roman" w:hAnsi="Onest" w:cs="Segoe UI"/>
+          <w:kern w:val="0"/>
+          <w:sz w:val="20"/>
           <w:szCs w:val="21"/>
           <w14:ligatures w14:val="none"/>
         </w:rPr>
@@ -3851,33 +3771,35 @@
     </w:p>
     <w:p>
       <w:pPr>
+        <w:keepLines/>
         <w:numPr>
           <w:ilvl w:val="0"/>
           <w:numId w:val="12"/>
         </w:numPr>
-        <w:spacing w:before="100" w:beforeAutospacing="1" w:after="100" w:afterAutospacing="1" w:line="300" w:lineRule="atLeast"/>
-        <w:rPr>
-          <w:rFonts w:ascii="Onest" w:eastAsia="Times New Roman" w:hAnsi="Onest" w:cs="Segoe UI"/>
-          <w:kern w:val="0"/>
-          <w:sz w:val="21"/>
-          <w:szCs w:val="21"/>
-          <w14:ligatures w14:val="none"/>
-        </w:rPr>
-      </w:pPr>
-      <w:r>
-        <w:rPr>
-          <w:rFonts w:ascii="Onest" w:eastAsia="Times New Roman" w:hAnsi="Onest" w:cs="Segoe UI"/>
-          <w:kern w:val="0"/>
-          <w:sz w:val="21"/>
-          <w:szCs w:val="21"/>
-          <w14:ligatures w14:val="none"/>
-        </w:rPr>
-        <w:t>Add safety limits</w:t>
-      </w:r>
-    </w:p>
-    <w:p>
-      <w:pPr>
-        <w:spacing w:before="100" w:beforeAutospacing="1" w:after="100" w:afterAutospacing="1" w:line="300" w:lineRule="atLeast"/>
+        <w:spacing w:before="0" w:after="40" w:line="240" w:lineRule="auto"/>
+        <w:rPr>
+          <w:rFonts w:ascii="Onest" w:eastAsia="Times New Roman" w:hAnsi="Onest" w:cs="Segoe UI"/>
+          <w:kern w:val="0"/>
+          <w:sz w:val="21"/>
+          <w:szCs w:val="21"/>
+          <w14:ligatures w14:val="none"/>
+        </w:rPr>
+      </w:pPr>
+      <w:r>
+        <w:rPr>
+          <w:rFonts w:ascii="Onest" w:eastAsia="Times New Roman" w:hAnsi="Onest" w:cs="Segoe UI"/>
+          <w:kern w:val="0"/>
+          <w:sz w:val="20"/>
+          <w:szCs w:val="21"/>
+          <w14:ligatures w14:val="none"/>
+        </w:rPr>
+        <w:t>Test calibrated servo limits, stale-input watchdogs, and fault-triggered output disable with servo power disconnected</w:t>
+      </w:r>
+    </w:p>
+    <w:p>
+      <w:pPr>
+        <w:keepLines/>
+        <w:spacing w:before="0" w:after="40" w:line="240" w:lineRule="auto"/>
         <w:rPr>
           <w:rFonts w:ascii="Onest" w:eastAsia="Times New Roman" w:hAnsi="Onest" w:cs="Segoe UI"/>
           <w:kern w:val="0"/>
@@ -3900,50 +3822,52 @@
     </w:p>
     <w:p>
       <w:pPr>
+        <w:keepLines/>
         <w:numPr>
           <w:ilvl w:val="0"/>
           <w:numId w:val="13"/>
         </w:numPr>
-        <w:spacing w:before="100" w:beforeAutospacing="1" w:after="100" w:afterAutospacing="1" w:line="300" w:lineRule="atLeast"/>
-        <w:rPr>
-          <w:rFonts w:ascii="Onest" w:eastAsia="Times New Roman" w:hAnsi="Onest" w:cs="Segoe UI"/>
-          <w:kern w:val="0"/>
-          <w:sz w:val="21"/>
-          <w:szCs w:val="21"/>
-          <w14:ligatures w14:val="none"/>
-        </w:rPr>
-      </w:pPr>
-      <w:r>
-        <w:rPr>
-          <w:rFonts w:ascii="Onest" w:eastAsia="Times New Roman" w:hAnsi="Onest" w:cs="Segoe UI"/>
-          <w:kern w:val="0"/>
-          <w:sz w:val="21"/>
-          <w:szCs w:val="21"/>
-          <w14:ligatures w14:val="none"/>
-        </w:rPr>
-        <w:t>Add new control modes (position vs velocity)</w:t>
-      </w:r>
-    </w:p>
-    <w:p>
-      <w:pPr>
+        <w:spacing w:before="0" w:after="40" w:line="240" w:lineRule="auto"/>
+        <w:rPr>
+          <w:rFonts w:ascii="Onest" w:eastAsia="Times New Roman" w:hAnsi="Onest" w:cs="Segoe UI"/>
+          <w:kern w:val="0"/>
+          <w:sz w:val="21"/>
+          <w:szCs w:val="21"/>
+          <w14:ligatures w14:val="none"/>
+        </w:rPr>
+      </w:pPr>
+      <w:r>
+        <w:rPr>
+          <w:rFonts w:ascii="Onest" w:eastAsia="Times New Roman" w:hAnsi="Onest" w:cs="Segoe UI"/>
+          <w:kern w:val="0"/>
+          <w:sz w:val="20"/>
+          <w:szCs w:val="21"/>
+          <w14:ligatures w14:val="none"/>
+        </w:rPr>
+        <w:t>Compare and extend the existing joystick, direct-joint, and IK control modes</w:t>
+      </w:r>
+    </w:p>
+    <w:p>
+      <w:pPr>
+        <w:keepLines/>
         <w:numPr>
           <w:ilvl w:val="0"/>
           <w:numId w:val="13"/>
         </w:numPr>
-        <w:spacing w:before="100" w:beforeAutospacing="1" w:after="100" w:afterAutospacing="1" w:line="300" w:lineRule="atLeast"/>
-        <w:rPr>
-          <w:rFonts w:ascii="Onest" w:eastAsia="Times New Roman" w:hAnsi="Onest" w:cs="Segoe UI"/>
-          <w:kern w:val="0"/>
-          <w:sz w:val="21"/>
-          <w:szCs w:val="21"/>
-          <w14:ligatures w14:val="none"/>
-        </w:rPr>
-      </w:pPr>
-      <w:r>
-        <w:rPr>
-          <w:rFonts w:ascii="Onest" w:eastAsia="Times New Roman" w:hAnsi="Onest" w:cs="Segoe UI"/>
-          <w:kern w:val="0"/>
-          <w:sz w:val="21"/>
+        <w:spacing w:before="0" w:after="40" w:line="240" w:lineRule="auto"/>
+        <w:rPr>
+          <w:rFonts w:ascii="Onest" w:eastAsia="Times New Roman" w:hAnsi="Onest" w:cs="Segoe UI"/>
+          <w:kern w:val="0"/>
+          <w:sz w:val="21"/>
+          <w:szCs w:val="21"/>
+          <w14:ligatures w14:val="none"/>
+        </w:rPr>
+      </w:pPr>
+      <w:r>
+        <w:rPr>
+          <w:rFonts w:ascii="Onest" w:eastAsia="Times New Roman" w:hAnsi="Onest" w:cs="Segoe UI"/>
+          <w:kern w:val="0"/>
+          <w:sz w:val="20"/>
           <w:szCs w:val="21"/>
           <w14:ligatures w14:val="none"/>
         </w:rPr>
@@ -3952,24 +3876,25 @@
     </w:p>
     <w:p>
       <w:pPr>
+        <w:keepLines/>
         <w:numPr>
           <w:ilvl w:val="0"/>
           <w:numId w:val="13"/>
         </w:numPr>
-        <w:spacing w:before="100" w:beforeAutospacing="1" w:after="100" w:afterAutospacing="1" w:line="300" w:lineRule="atLeast"/>
-        <w:rPr>
-          <w:rFonts w:ascii="Onest" w:eastAsia="Times New Roman" w:hAnsi="Onest" w:cs="Segoe UI"/>
-          <w:kern w:val="0"/>
-          <w:sz w:val="21"/>
-          <w:szCs w:val="21"/>
-          <w14:ligatures w14:val="none"/>
-        </w:rPr>
-      </w:pPr>
-      <w:r>
-        <w:rPr>
-          <w:rFonts w:ascii="Onest" w:eastAsia="Times New Roman" w:hAnsi="Onest" w:cs="Segoe UI"/>
-          <w:kern w:val="0"/>
-          <w:sz w:val="21"/>
+        <w:spacing w:before="0" w:after="40" w:line="240" w:lineRule="auto"/>
+        <w:rPr>
+          <w:rFonts w:ascii="Onest" w:eastAsia="Times New Roman" w:hAnsi="Onest" w:cs="Segoe UI"/>
+          <w:kern w:val="0"/>
+          <w:sz w:val="21"/>
+          <w:szCs w:val="21"/>
+          <w14:ligatures w14:val="none"/>
+        </w:rPr>
+      </w:pPr>
+      <w:r>
+        <w:rPr>
+          <w:rFonts w:ascii="Onest" w:eastAsia="Times New Roman" w:hAnsi="Onest" w:cs="Segoe UI"/>
+          <w:kern w:val="0"/>
+          <w:sz w:val="20"/>
           <w:szCs w:val="21"/>
           <w14:ligatures w14:val="none"/>
         </w:rPr>
@@ -3978,7 +3903,8 @@
     </w:p>
     <w:p>
       <w:pPr>
-        <w:spacing w:before="100" w:beforeAutospacing="1" w:after="100" w:afterAutospacing="1" w:line="300" w:lineRule="atLeast"/>
+        <w:keepLines/>
+        <w:spacing w:before="0" w:after="40" w:line="240" w:lineRule="auto"/>
         <w:rPr>
           <w:rFonts w:ascii="Onest" w:eastAsia="Times New Roman" w:hAnsi="Onest" w:cs="Segoe UI"/>
           <w:kern w:val="0"/>
@@ -4000,24 +3926,25 @@
     </w:p>
     <w:p>
       <w:pPr>
+        <w:keepLines/>
         <w:numPr>
           <w:ilvl w:val="0"/>
           <w:numId w:val="14"/>
         </w:numPr>
-        <w:spacing w:before="100" w:beforeAutospacing="1" w:after="100" w:afterAutospacing="1" w:line="300" w:lineRule="atLeast"/>
-        <w:rPr>
-          <w:rFonts w:ascii="Onest" w:eastAsia="Times New Roman" w:hAnsi="Onest" w:cs="Segoe UI"/>
-          <w:kern w:val="0"/>
-          <w:sz w:val="21"/>
-          <w:szCs w:val="21"/>
-          <w14:ligatures w14:val="none"/>
-        </w:rPr>
-      </w:pPr>
-      <w:r>
-        <w:rPr>
-          <w:rFonts w:ascii="Onest" w:eastAsia="Times New Roman" w:hAnsi="Onest" w:cs="Segoe UI"/>
-          <w:kern w:val="0"/>
-          <w:sz w:val="21"/>
+        <w:spacing w:before="0" w:after="40" w:line="240" w:lineRule="auto"/>
+        <w:rPr>
+          <w:rFonts w:ascii="Onest" w:eastAsia="Times New Roman" w:hAnsi="Onest" w:cs="Segoe UI"/>
+          <w:kern w:val="0"/>
+          <w:sz w:val="21"/>
+          <w:szCs w:val="21"/>
+          <w14:ligatures w14:val="none"/>
+        </w:rPr>
+      </w:pPr>
+      <w:r>
+        <w:rPr>
+          <w:rFonts w:ascii="Onest" w:eastAsia="Times New Roman" w:hAnsi="Onest" w:cs="Segoe UI"/>
+          <w:kern w:val="0"/>
+          <w:sz w:val="20"/>
           <w:szCs w:val="21"/>
           <w14:ligatures w14:val="none"/>
         </w:rPr>
@@ -4026,85 +3953,90 @@
     </w:p>
     <w:p>
       <w:pPr>
+        <w:keepLines/>
         <w:numPr>
           <w:ilvl w:val="0"/>
           <w:numId w:val="14"/>
         </w:numPr>
-        <w:spacing w:before="100" w:beforeAutospacing="1" w:after="100" w:afterAutospacing="1" w:line="300" w:lineRule="atLeast"/>
-        <w:rPr>
-          <w:rFonts w:ascii="Onest" w:eastAsia="Times New Roman" w:hAnsi="Onest" w:cs="Segoe UI"/>
-          <w:kern w:val="0"/>
-          <w:sz w:val="21"/>
-          <w:szCs w:val="21"/>
-          <w14:ligatures w14:val="none"/>
-        </w:rPr>
-      </w:pPr>
-      <w:r>
-        <w:rPr>
-          <w:rFonts w:ascii="Onest" w:eastAsia="Times New Roman" w:hAnsi="Onest" w:cs="Segoe UI"/>
-          <w:kern w:val="0"/>
-          <w:sz w:val="21"/>
-          <w:szCs w:val="21"/>
-          <w14:ligatures w14:val="none"/>
-        </w:rPr>
-        <w:t>Implement inverse kinematics</w:t>
-      </w:r>
-    </w:p>
-    <w:p>
-      <w:pPr>
+        <w:spacing w:before="0" w:after="40" w:line="240" w:lineRule="auto"/>
+        <w:rPr>
+          <w:rFonts w:ascii="Onest" w:eastAsia="Times New Roman" w:hAnsi="Onest" w:cs="Segoe UI"/>
+          <w:kern w:val="0"/>
+          <w:sz w:val="21"/>
+          <w:szCs w:val="21"/>
+          <w14:ligatures w14:val="none"/>
+        </w:rPr>
+      </w:pPr>
+      <w:r>
+        <w:rPr>
+          <w:rFonts w:ascii="Onest" w:eastAsia="Times New Roman" w:hAnsi="Onest" w:cs="Segoe UI"/>
+          <w:kern w:val="0"/>
+          <w:sz w:val="20"/>
+          <w:szCs w:val="21"/>
+          <w14:ligatures w14:val="none"/>
+        </w:rPr>
+        <w:t>Evaluate or extend the existing KDL inverse kinematics solver</w:t>
+      </w:r>
+    </w:p>
+    <w:p>
+      <w:pPr>
+        <w:keepLines/>
         <w:numPr>
           <w:ilvl w:val="0"/>
           <w:numId w:val="14"/>
         </w:numPr>
-        <w:spacing w:before="100" w:beforeAutospacing="1" w:after="100" w:afterAutospacing="1" w:line="300" w:lineRule="atLeast"/>
-        <w:rPr>
-          <w:rFonts w:ascii="Onest" w:eastAsia="Times New Roman" w:hAnsi="Onest" w:cs="Segoe UI"/>
-          <w:kern w:val="0"/>
-          <w:sz w:val="21"/>
-          <w:szCs w:val="21"/>
-          <w14:ligatures w14:val="none"/>
-        </w:rPr>
-      </w:pPr>
-      <w:r>
-        <w:rPr>
-          <w:rFonts w:ascii="Onest" w:eastAsia="Times New Roman" w:hAnsi="Onest" w:cs="Segoe UI"/>
-          <w:kern w:val="0"/>
-          <w:sz w:val="21"/>
-          <w:szCs w:val="21"/>
-          <w14:ligatures w14:val="none"/>
-        </w:rPr>
-        <w:t>Build autonomous behaviors</w:t>
-      </w:r>
-    </w:p>
-    <w:p>
-      <w:pPr>
+        <w:spacing w:before="0" w:after="40" w:line="240" w:lineRule="auto"/>
+        <w:rPr>
+          <w:rFonts w:ascii="Onest" w:eastAsia="Times New Roman" w:hAnsi="Onest" w:cs="Segoe UI"/>
+          <w:kern w:val="0"/>
+          <w:sz w:val="21"/>
+          <w:szCs w:val="21"/>
+          <w14:ligatures w14:val="none"/>
+        </w:rPr>
+      </w:pPr>
+      <w:r>
+        <w:rPr>
+          <w:rFonts w:ascii="Onest" w:eastAsia="Times New Roman" w:hAnsi="Onest" w:cs="Segoe UI"/>
+          <w:kern w:val="0"/>
+          <w:sz w:val="20"/>
+          <w:szCs w:val="21"/>
+          <w14:ligatures w14:val="none"/>
+        </w:rPr>
+        <w:t>Design bounded autonomous behaviors only after verifying the physical joint map; retain explicit arming, an expiring command lease, and a hardware output-disable watchdog</w:t>
+      </w:r>
+    </w:p>
+    <w:p>
+      <w:pPr>
+        <w:keepLines/>
         <w:numPr>
           <w:ilvl w:val="0"/>
           <w:numId w:val="14"/>
         </w:numPr>
-        <w:spacing w:before="100" w:beforeAutospacing="1" w:after="100" w:afterAutospacing="1" w:line="300" w:lineRule="atLeast"/>
-        <w:rPr>
-          <w:rFonts w:ascii="Onest" w:eastAsia="Times New Roman" w:hAnsi="Onest" w:cs="Segoe UI"/>
-          <w:kern w:val="0"/>
-          <w:sz w:val="21"/>
-          <w:szCs w:val="21"/>
-          <w14:ligatures w14:val="none"/>
-        </w:rPr>
-      </w:pPr>
-      <w:r>
-        <w:rPr>
-          <w:rFonts w:ascii="Onest" w:eastAsia="Times New Roman" w:hAnsi="Onest" w:cs="Segoe UI"/>
-          <w:kern w:val="0"/>
-          <w:sz w:val="21"/>
-          <w:szCs w:val="21"/>
-          <w14:ligatures w14:val="none"/>
-        </w:rPr>
-        <w:t>Replace gamepad with web or AI control</w:t>
-      </w:r>
-    </w:p>
-    <w:p>
-      <w:pPr>
-        <w:spacing w:before="100" w:beforeAutospacing="1" w:after="100" w:afterAutospacing="1" w:line="300" w:lineRule="atLeast"/>
+        <w:spacing w:before="0" w:after="40" w:line="240" w:lineRule="auto"/>
+        <w:rPr>
+          <w:rFonts w:ascii="Onest" w:eastAsia="Times New Roman" w:hAnsi="Onest" w:cs="Segoe UI"/>
+          <w:kern w:val="0"/>
+          <w:sz w:val="21"/>
+          <w:szCs w:val="21"/>
+          <w14:ligatures w14:val="none"/>
+        </w:rPr>
+      </w:pPr>
+      <w:r>
+        <w:rPr>
+          <w:rFonts w:ascii="Onest" w:eastAsia="Times New Roman" w:hAnsi="Onest" w:cs="Segoe UI"/>
+          <w:kern w:val="0"/>
+          <w:sz w:val="20"/>
+          <w:szCs w:val="21"/>
+          <w14:ligatures w14:val="none"/>
+        </w:rPr>
+        <w:t>Evaluate a web or AI command gateway only after adding authenticated authorization, schema validation, rate limits, and independent actuator bounds</w:t>
+      </w:r>
+    </w:p>
+    <w:p>
+      <w:pPr>
+        <w:keepLines/>
+        <w:pageBreakBefore/>
+        <w:spacing w:before="0" w:after="40" w:line="240" w:lineRule="auto"/>
         <w:rPr>
           <w:rFonts w:ascii="Onest" w:eastAsia="Times New Roman" w:hAnsi="Onest" w:cs="Segoe UI"/>
           <w:kern w:val="0"/>
@@ -4126,24 +4058,25 @@
     </w:p>
     <w:p>
       <w:pPr>
+        <w:keepLines/>
         <w:numPr>
           <w:ilvl w:val="0"/>
           <w:numId w:val="15"/>
         </w:numPr>
-        <w:spacing w:before="100" w:beforeAutospacing="1" w:after="100" w:afterAutospacing="1" w:line="300" w:lineRule="atLeast"/>
-        <w:rPr>
-          <w:rFonts w:ascii="Onest" w:eastAsia="Times New Roman" w:hAnsi="Onest" w:cs="Segoe UI"/>
-          <w:kern w:val="0"/>
-          <w:sz w:val="21"/>
-          <w:szCs w:val="21"/>
-          <w14:ligatures w14:val="none"/>
-        </w:rPr>
-      </w:pPr>
-      <w:r>
-        <w:rPr>
-          <w:rFonts w:ascii="Onest" w:eastAsia="Times New Roman" w:hAnsi="Onest" w:cs="Segoe UI"/>
-          <w:kern w:val="0"/>
-          <w:sz w:val="21"/>
+        <w:spacing w:before="0" w:after="40" w:line="240" w:lineRule="auto"/>
+        <w:rPr>
+          <w:rFonts w:ascii="Onest" w:eastAsia="Times New Roman" w:hAnsi="Onest" w:cs="Segoe UI"/>
+          <w:kern w:val="0"/>
+          <w:sz w:val="21"/>
+          <w:szCs w:val="21"/>
+          <w14:ligatures w14:val="none"/>
+        </w:rPr>
+      </w:pPr>
+      <w:r>
+        <w:rPr>
+          <w:rFonts w:ascii="Onest" w:eastAsia="Times New Roman" w:hAnsi="Onest" w:cs="Segoe UI"/>
+          <w:kern w:val="0"/>
+          <w:sz w:val="20"/>
           <w:szCs w:val="21"/>
           <w14:ligatures w14:val="none"/>
         </w:rPr>
@@ -4153,7 +4086,7 @@
         <w:rPr>
           <w:rFonts w:ascii="Onest" w:eastAsia="Times New Roman" w:hAnsi="Onest" w:cs="Segoe UI"/>
           <w:kern w:val="0"/>
-          <w:sz w:val="21"/>
+          <w:sz w:val="20"/>
           <w:szCs w:val="21"/>
           <w14:ligatures w14:val="none"/>
         </w:rPr>
@@ -4163,7 +4096,7 @@
         <w:rPr>
           <w:rFonts w:ascii="Onest" w:eastAsia="Times New Roman" w:hAnsi="Onest" w:cs="Segoe UI"/>
           <w:kern w:val="0"/>
-          <w:sz w:val="21"/>
+          <w:sz w:val="20"/>
           <w:szCs w:val="21"/>
           <w14:ligatures w14:val="none"/>
         </w:rPr>
@@ -4172,24 +4105,25 @@
     </w:p>
     <w:p>
       <w:pPr>
+        <w:keepLines/>
         <w:numPr>
           <w:ilvl w:val="0"/>
           <w:numId w:val="15"/>
         </w:numPr>
-        <w:spacing w:before="100" w:beforeAutospacing="1" w:after="100" w:afterAutospacing="1" w:line="300" w:lineRule="atLeast"/>
-        <w:rPr>
-          <w:rFonts w:ascii="Onest" w:eastAsia="Times New Roman" w:hAnsi="Onest" w:cs="Segoe UI"/>
-          <w:kern w:val="0"/>
-          <w:sz w:val="21"/>
-          <w:szCs w:val="21"/>
-          <w14:ligatures w14:val="none"/>
-        </w:rPr>
-      </w:pPr>
-      <w:r>
-        <w:rPr>
-          <w:rFonts w:ascii="Onest" w:eastAsia="Times New Roman" w:hAnsi="Onest" w:cs="Segoe UI"/>
-          <w:kern w:val="0"/>
-          <w:sz w:val="21"/>
+        <w:spacing w:before="0" w:after="40" w:line="240" w:lineRule="auto"/>
+        <w:rPr>
+          <w:rFonts w:ascii="Onest" w:eastAsia="Times New Roman" w:hAnsi="Onest" w:cs="Segoe UI"/>
+          <w:kern w:val="0"/>
+          <w:sz w:val="21"/>
+          <w:szCs w:val="21"/>
+          <w14:ligatures w14:val="none"/>
+        </w:rPr>
+      </w:pPr>
+      <w:r>
+        <w:rPr>
+          <w:rFonts w:ascii="Onest" w:eastAsia="Times New Roman" w:hAnsi="Onest" w:cs="Segoe UI"/>
+          <w:kern w:val="0"/>
+          <w:sz w:val="20"/>
           <w:szCs w:val="21"/>
           <w14:ligatures w14:val="none"/>
         </w:rPr>
@@ -4198,50 +4132,52 @@
     </w:p>
     <w:p>
       <w:pPr>
+        <w:keepLines/>
         <w:numPr>
           <w:ilvl w:val="0"/>
           <w:numId w:val="15"/>
         </w:numPr>
-        <w:spacing w:before="100" w:beforeAutospacing="1" w:after="100" w:afterAutospacing="1" w:line="300" w:lineRule="atLeast"/>
-        <w:rPr>
-          <w:rFonts w:ascii="Onest" w:eastAsia="Times New Roman" w:hAnsi="Onest" w:cs="Segoe UI"/>
-          <w:kern w:val="0"/>
-          <w:sz w:val="21"/>
-          <w:szCs w:val="21"/>
-          <w14:ligatures w14:val="none"/>
-        </w:rPr>
-      </w:pPr>
-      <w:r>
-        <w:rPr>
-          <w:rFonts w:ascii="Onest" w:eastAsia="Times New Roman" w:hAnsi="Onest" w:cs="Segoe UI"/>
-          <w:kern w:val="0"/>
-          <w:sz w:val="21"/>
-          <w:szCs w:val="21"/>
-          <w14:ligatures w14:val="none"/>
-        </w:rPr>
-        <w:t>Real-time systems: latency and responsiveness analysis</w:t>
-      </w:r>
-    </w:p>
-    <w:p>
-      <w:pPr>
+        <w:spacing w:before="0" w:after="40" w:line="240" w:lineRule="auto"/>
+        <w:rPr>
+          <w:rFonts w:ascii="Onest" w:eastAsia="Times New Roman" w:hAnsi="Onest" w:cs="Segoe UI"/>
+          <w:kern w:val="0"/>
+          <w:sz w:val="21"/>
+          <w:szCs w:val="21"/>
+          <w14:ligatures w14:val="none"/>
+        </w:rPr>
+      </w:pPr>
+      <w:r>
+        <w:rPr>
+          <w:rFonts w:ascii="Onest" w:eastAsia="Times New Roman" w:hAnsi="Onest" w:cs="Segoe UI"/>
+          <w:kern w:val="0"/>
+          <w:sz w:val="20"/>
+          <w:szCs w:val="21"/>
+          <w14:ligatures w14:val="none"/>
+        </w:rPr>
+        <w:t>Real-time systems: measure 50 Hz loop latency, jitter, and responsiveness</w:t>
+      </w:r>
+    </w:p>
+    <w:p>
+      <w:pPr>
+        <w:keepLines/>
         <w:numPr>
           <w:ilvl w:val="0"/>
           <w:numId w:val="15"/>
         </w:numPr>
-        <w:spacing w:before="100" w:beforeAutospacing="1" w:after="100" w:afterAutospacing="1" w:line="300" w:lineRule="atLeast"/>
-        <w:rPr>
-          <w:rFonts w:ascii="Onest" w:eastAsia="Times New Roman" w:hAnsi="Onest" w:cs="Segoe UI"/>
-          <w:kern w:val="0"/>
-          <w:sz w:val="21"/>
-          <w:szCs w:val="21"/>
-          <w14:ligatures w14:val="none"/>
-        </w:rPr>
-      </w:pPr>
-      <w:r>
-        <w:rPr>
-          <w:rFonts w:ascii="Onest" w:eastAsia="Times New Roman" w:hAnsi="Onest" w:cs="Segoe UI"/>
-          <w:kern w:val="0"/>
-          <w:sz w:val="21"/>
+        <w:spacing w:before="0" w:after="40" w:line="240" w:lineRule="auto"/>
+        <w:rPr>
+          <w:rFonts w:ascii="Onest" w:eastAsia="Times New Roman" w:hAnsi="Onest" w:cs="Segoe UI"/>
+          <w:kern w:val="0"/>
+          <w:sz w:val="21"/>
+          <w:szCs w:val="21"/>
+          <w14:ligatures w14:val="none"/>
+        </w:rPr>
+      </w:pPr>
+      <w:r>
+        <w:rPr>
+          <w:rFonts w:ascii="Onest" w:eastAsia="Times New Roman" w:hAnsi="Onest" w:cs="Segoe UI"/>
+          <w:kern w:val="0"/>
+          <w:sz w:val="20"/>
           <w:szCs w:val="21"/>
           <w14:ligatures w14:val="none"/>
         </w:rPr>
@@ -4250,24 +4186,25 @@
     </w:p>
     <w:p>
       <w:pPr>
+        <w:keepLines/>
         <w:numPr>
           <w:ilvl w:val="0"/>
           <w:numId w:val="15"/>
         </w:numPr>
-        <w:spacing w:before="100" w:beforeAutospacing="1" w:after="100" w:afterAutospacing="1" w:line="300" w:lineRule="atLeast"/>
-        <w:rPr>
-          <w:rFonts w:ascii="Onest" w:eastAsia="Times New Roman" w:hAnsi="Onest" w:cs="Segoe UI"/>
-          <w:kern w:val="0"/>
-          <w:sz w:val="21"/>
-          <w:szCs w:val="21"/>
-          <w14:ligatures w14:val="none"/>
-        </w:rPr>
-      </w:pPr>
-      <w:r>
-        <w:rPr>
-          <w:rFonts w:ascii="Onest" w:eastAsia="Times New Roman" w:hAnsi="Onest" w:cs="Segoe UI"/>
-          <w:kern w:val="0"/>
-          <w:sz w:val="21"/>
+        <w:spacing w:before="0" w:after="40" w:line="240" w:lineRule="auto"/>
+        <w:rPr>
+          <w:rFonts w:ascii="Onest" w:eastAsia="Times New Roman" w:hAnsi="Onest" w:cs="Segoe UI"/>
+          <w:kern w:val="0"/>
+          <w:sz w:val="21"/>
+          <w:szCs w:val="21"/>
+          <w14:ligatures w14:val="none"/>
+        </w:rPr>
+      </w:pPr>
+      <w:r>
+        <w:rPr>
+          <w:rFonts w:ascii="Onest" w:eastAsia="Times New Roman" w:hAnsi="Onest" w:cs="Segoe UI"/>
+          <w:kern w:val="0"/>
+          <w:sz w:val="20"/>
           <w:szCs w:val="21"/>
           <w14:ligatures w14:val="none"/>
         </w:rPr>
@@ -4276,6 +4213,7 @@
     </w:p>
     <w:p>
       <w:pPr>
+        <w:keepNext/>
         <w:spacing w:before="100" w:beforeAutospacing="1" w:after="100" w:afterAutospacing="1" w:line="300" w:lineRule="atLeast"/>
         <w:outlineLvl w:val="1"/>
         <w:rPr>
@@ -4315,7 +4253,9 @@
     </w:p>
     <w:p>
       <w:pPr>
-        <w:spacing w:before="100" w:beforeAutospacing="1" w:after="100" w:afterAutospacing="1" w:line="300" w:lineRule="atLeast"/>
+        <w:spacing w:before="0" w:beforeAutospacing="1" w:after="60" w:afterAutospacing="1" w:line="240" w:lineRule="auto"/>
+        <w:ind w:left="0" w:right="0" w:firstLine="0"/>
+        <w:jc w:val="left"/>
         <w:rPr>
           <w:rFonts w:ascii="Onest" w:eastAsia="Times New Roman" w:hAnsi="Onest" w:cs="Segoe UI"/>
           <w:kern w:val="0"/>
@@ -4339,68 +4279,22 @@
       <w:r>
         <w:rPr>
           <w:rFonts w:ascii="Onest" w:eastAsia="Times New Roman" w:hAnsi="Onest" w:cs="Segoe UI"/>
+          <w:b w:val="0"/>
+          <w:bCs/>
           <w:kern w:val="0"/>
           <w:sz w:val="21"/>
           <w:szCs w:val="21"/>
           <w14:ligatures w14:val="none"/>
         </w:rPr>
         <w:br/>
-        <w:t xml:space="preserve">Yes, with guidance. It combines hardware </w:t>
-      </w:r>
-      <w:r>
-        <w:rPr>
-          <w:rFonts w:ascii="Onest" w:eastAsia="Times New Roman" w:hAnsi="Onest" w:cs="Segoe UI"/>
-          <w:kern w:val="0"/>
-          <w:sz w:val="21"/>
-          <w:szCs w:val="21"/>
-          <w14:ligatures w14:val="none"/>
-        </w:rPr>
-        <w:t>and</w:t>
-      </w:r>
-      <w:r>
-        <w:rPr>
-          <w:rFonts w:ascii="Onest" w:eastAsia="Times New Roman" w:hAnsi="Onest" w:cs="Segoe UI"/>
-          <w:kern w:val="0"/>
-          <w:sz w:val="21"/>
-          <w:szCs w:val="21"/>
-          <w14:ligatures w14:val="none"/>
-        </w:rPr>
-        <w:t xml:space="preserve"> software</w:t>
-      </w:r>
-      <w:r>
-        <w:rPr>
-          <w:rFonts w:ascii="Onest" w:eastAsia="Times New Roman" w:hAnsi="Onest" w:cs="Segoe UI"/>
-          <w:kern w:val="0"/>
-          <w:sz w:val="21"/>
-          <w:szCs w:val="21"/>
-          <w14:ligatures w14:val="none"/>
-        </w:rPr>
-        <w:t xml:space="preserve"> elements, so if the students don’t have any embedded experience, </w:t>
-      </w:r>
-      <w:r>
-        <w:rPr>
-          <w:rFonts w:ascii="Onest" w:eastAsia="Times New Roman" w:hAnsi="Onest" w:cs="Segoe UI"/>
-          <w:kern w:val="0"/>
-          <w:sz w:val="21"/>
-          <w:szCs w:val="21"/>
-          <w14:ligatures w14:val="none"/>
-        </w:rPr>
-        <w:t xml:space="preserve">support </w:t>
-      </w:r>
-      <w:r>
-        <w:rPr>
-          <w:rFonts w:ascii="Onest" w:eastAsia="Times New Roman" w:hAnsi="Onest" w:cs="Segoe UI"/>
-          <w:kern w:val="0"/>
-          <w:sz w:val="21"/>
-          <w:szCs w:val="21"/>
-          <w14:ligatures w14:val="none"/>
-        </w:rPr>
-        <w:t>will be necessary.</w:t>
-      </w:r>
-    </w:p>
-    <w:p>
-      <w:pPr>
-        <w:spacing w:before="100" w:beforeAutospacing="1" w:after="100" w:afterAutospacing="1" w:line="300" w:lineRule="atLeast"/>
+        <w:t>Yes, with guidance; students without embedded-systems experience need support.</w:t>
+      </w:r>
+    </w:p>
+    <w:p>
+      <w:pPr>
+        <w:spacing w:before="0" w:beforeAutospacing="1" w:after="60" w:afterAutospacing="1" w:line="240" w:lineRule="auto"/>
+        <w:ind w:left="0" w:right="0" w:firstLine="0"/>
+        <w:jc w:val="left"/>
         <w:rPr>
           <w:rFonts w:ascii="Onest" w:eastAsia="Times New Roman" w:hAnsi="Onest" w:cs="Segoe UI"/>
           <w:kern w:val="0"/>
@@ -4419,8 +4313,35 @@
           <w:szCs w:val="21"/>
           <w14:ligatures w14:val="none"/>
         </w:rPr>
-        <w:t xml:space="preserve">Q: Can this </w:t>
-      </w:r>
+        <w:t>Q: Can this project be used without QNX?</w:t>
+      </w:r>
+      <w:r>
+        <w:rPr>
+          <w:rFonts w:ascii="Onest" w:eastAsia="Times New Roman" w:hAnsi="Onest" w:cs="Segoe UI"/>
+          <w:b w:val="0"/>
+          <w:bCs/>
+          <w:kern w:val="0"/>
+          <w:sz w:val="21"/>
+          <w:szCs w:val="21"/>
+          <w14:ligatures w14:val="none"/>
+        </w:rPr>
+        <w:br/>
+        <w:t>It has not been tested on Linux; the code and instructions target QNX, although the concepts transfer.</w:t>
+      </w:r>
+    </w:p>
+    <w:p>
+      <w:pPr>
+        <w:spacing w:before="0" w:beforeAutospacing="1" w:after="60" w:afterAutospacing="1" w:line="240" w:lineRule="auto"/>
+        <w:ind w:left="0" w:right="0" w:firstLine="0"/>
+        <w:jc w:val="left"/>
+        <w:rPr>
+          <w:rFonts w:ascii="Onest" w:eastAsia="Times New Roman" w:hAnsi="Onest" w:cs="Segoe UI"/>
+          <w:kern w:val="0"/>
+          <w:sz w:val="21"/>
+          <w:szCs w:val="21"/>
+          <w14:ligatures w14:val="none"/>
+        </w:rPr>
+      </w:pPr>
       <w:r>
         <w:rPr>
           <w:rFonts w:ascii="Onest" w:eastAsia="Times New Roman" w:hAnsi="Onest" w:cs="Segoe UI"/>
@@ -4431,8 +4352,35 @@
           <w:szCs w:val="21"/>
           <w14:ligatures w14:val="none"/>
         </w:rPr>
-        <w:t xml:space="preserve">project be used </w:t>
-      </w:r>
+        <w:t>Q: Do you need a 3D printer?</w:t>
+      </w:r>
+      <w:r>
+        <w:rPr>
+          <w:rFonts w:ascii="Onest" w:eastAsia="Times New Roman" w:hAnsi="Onest" w:cs="Segoe UI"/>
+          <w:b w:val="0"/>
+          <w:bCs/>
+          <w:kern w:val="0"/>
+          <w:sz w:val="21"/>
+          <w:szCs w:val="21"/>
+          <w14:ligatures w14:val="none"/>
+        </w:rPr>
+        <w:br/>
+        <w:t>Currently yes, unless an instructor supplies preprinted parts or a complete kit.</w:t>
+      </w:r>
+    </w:p>
+    <w:p>
+      <w:pPr>
+        <w:spacing w:before="0" w:beforeAutospacing="1" w:after="60" w:afterAutospacing="1" w:line="240" w:lineRule="auto"/>
+        <w:ind w:left="0" w:right="0" w:firstLine="0"/>
+        <w:jc w:val="left"/>
+        <w:rPr>
+          <w:rFonts w:ascii="Onest" w:eastAsia="Times New Roman" w:hAnsi="Onest" w:cs="Segoe UI"/>
+          <w:kern w:val="0"/>
+          <w:sz w:val="21"/>
+          <w:szCs w:val="21"/>
+          <w14:ligatures w14:val="none"/>
+        </w:rPr>
+      </w:pPr>
       <w:r>
         <w:rPr>
           <w:rFonts w:ascii="Onest" w:eastAsia="Times New Roman" w:hAnsi="Onest" w:cs="Segoe UI"/>
@@ -4443,417 +4391,20 @@
           <w:szCs w:val="21"/>
           <w14:ligatures w14:val="none"/>
         </w:rPr>
-        <w:t>without QNX?</w:t>
-      </w:r>
-      <w:r>
-        <w:rPr>
-          <w:rFonts w:ascii="Onest" w:eastAsia="Times New Roman" w:hAnsi="Onest" w:cs="Segoe UI"/>
+        <w:t>Q: Is this project safe?</w:t>
+      </w:r>
+      <w:r>
+        <w:rPr>
+          <w:rFonts w:ascii="Onest" w:eastAsia="Times New Roman" w:hAnsi="Onest" w:cs="Segoe UI"/>
+          <w:b w:val="0"/>
+          <w:bCs/>
           <w:kern w:val="0"/>
           <w:sz w:val="21"/>
           <w:szCs w:val="21"/>
           <w14:ligatures w14:val="none"/>
         </w:rPr>
         <w:br/>
-      </w:r>
-      <w:r>
-        <w:rPr>
-          <w:rFonts w:ascii="Onest" w:eastAsia="Times New Roman" w:hAnsi="Onest" w:cs="Segoe UI"/>
-          <w:kern w:val="0"/>
-          <w:sz w:val="21"/>
-          <w:szCs w:val="21"/>
-          <w14:ligatures w14:val="none"/>
-        </w:rPr>
-        <w:t>It hasn’t been tested with Linux and t</w:t>
-      </w:r>
-      <w:r>
-        <w:rPr>
-          <w:rFonts w:ascii="Onest" w:eastAsia="Times New Roman" w:hAnsi="Onest" w:cs="Segoe UI"/>
-          <w:kern w:val="0"/>
-          <w:sz w:val="21"/>
-          <w:szCs w:val="21"/>
-          <w14:ligatures w14:val="none"/>
-        </w:rPr>
-        <w:t>he repo</w:t>
-      </w:r>
-      <w:r>
-        <w:rPr>
-          <w:rFonts w:ascii="Onest" w:eastAsia="Times New Roman" w:hAnsi="Onest" w:cs="Segoe UI"/>
-          <w:kern w:val="0"/>
-          <w:sz w:val="21"/>
-          <w:szCs w:val="21"/>
-          <w14:ligatures w14:val="none"/>
-        </w:rPr>
-        <w:t xml:space="preserve">, instructions, and source </w:t>
-      </w:r>
-      <w:r>
-        <w:rPr>
-          <w:rFonts w:ascii="Onest" w:eastAsia="Times New Roman" w:hAnsi="Onest" w:cs="Segoe UI"/>
-          <w:kern w:val="0"/>
-          <w:sz w:val="21"/>
-          <w:szCs w:val="21"/>
-          <w14:ligatures w14:val="none"/>
-        </w:rPr>
-        <w:t>target QNX</w:t>
-      </w:r>
-      <w:r>
-        <w:rPr>
-          <w:rFonts w:ascii="Onest" w:eastAsia="Times New Roman" w:hAnsi="Onest" w:cs="Segoe UI"/>
-          <w:kern w:val="0"/>
-          <w:sz w:val="21"/>
-          <w:szCs w:val="21"/>
-          <w14:ligatures w14:val="none"/>
-        </w:rPr>
-        <w:t xml:space="preserve">. However, </w:t>
-      </w:r>
-      <w:r>
-        <w:rPr>
-          <w:rFonts w:ascii="Onest" w:eastAsia="Times New Roman" w:hAnsi="Onest" w:cs="Segoe UI"/>
-          <w:kern w:val="0"/>
-          <w:sz w:val="21"/>
-          <w:szCs w:val="21"/>
-          <w14:ligatures w14:val="none"/>
-        </w:rPr>
-        <w:t xml:space="preserve">the </w:t>
-      </w:r>
-      <w:r>
-        <w:rPr>
-          <w:rFonts w:ascii="Onest" w:eastAsia="Times New Roman" w:hAnsi="Onest" w:cs="Segoe UI"/>
-          <w:kern w:val="0"/>
-          <w:sz w:val="21"/>
-          <w:szCs w:val="21"/>
-          <w14:ligatures w14:val="none"/>
-        </w:rPr>
-        <w:t xml:space="preserve">concepts </w:t>
-      </w:r>
-      <w:r>
-        <w:rPr>
-          <w:rFonts w:ascii="Onest" w:eastAsia="Times New Roman" w:hAnsi="Onest" w:cs="Segoe UI"/>
-          <w:kern w:val="0"/>
-          <w:sz w:val="21"/>
-          <w:szCs w:val="21"/>
-          <w14:ligatures w14:val="none"/>
-        </w:rPr>
-        <w:t xml:space="preserve">generically </w:t>
-      </w:r>
-      <w:r>
-        <w:rPr>
-          <w:rFonts w:ascii="Onest" w:eastAsia="Times New Roman" w:hAnsi="Onest" w:cs="Segoe UI"/>
-          <w:kern w:val="0"/>
-          <w:sz w:val="21"/>
-          <w:szCs w:val="21"/>
-          <w14:ligatures w14:val="none"/>
-        </w:rPr>
-        <w:t xml:space="preserve">apply to Linux </w:t>
-      </w:r>
-      <w:r>
-        <w:rPr>
-          <w:rFonts w:ascii="Onest" w:eastAsia="Times New Roman" w:hAnsi="Onest" w:cs="Segoe UI"/>
-          <w:kern w:val="0"/>
-          <w:sz w:val="21"/>
-          <w:szCs w:val="21"/>
-          <w14:ligatures w14:val="none"/>
-        </w:rPr>
-        <w:t>or other generic</w:t>
-      </w:r>
-      <w:r>
-        <w:rPr>
-          <w:rFonts w:ascii="Onest" w:eastAsia="Times New Roman" w:hAnsi="Onest" w:cs="Segoe UI"/>
-          <w:kern w:val="0"/>
-          <w:sz w:val="21"/>
-          <w:szCs w:val="21"/>
-          <w14:ligatures w14:val="none"/>
-        </w:rPr>
-        <w:t xml:space="preserve"> ROS2</w:t>
-      </w:r>
-      <w:r>
-        <w:rPr>
-          <w:rFonts w:ascii="Onest" w:eastAsia="Times New Roman" w:hAnsi="Onest" w:cs="Segoe UI"/>
-          <w:kern w:val="0"/>
-          <w:sz w:val="21"/>
-          <w:szCs w:val="21"/>
-          <w14:ligatures w14:val="none"/>
-        </w:rPr>
-        <w:t xml:space="preserve"> setups.</w:t>
-      </w:r>
-    </w:p>
-    <w:p>
-      <w:pPr>
-        <w:spacing w:before="100" w:beforeAutospacing="1" w:after="100" w:afterAutospacing="1" w:line="300" w:lineRule="atLeast"/>
-        <w:rPr>
-          <w:rFonts w:ascii="Onest" w:eastAsia="Times New Roman" w:hAnsi="Onest" w:cs="Segoe UI"/>
-          <w:kern w:val="0"/>
-          <w:sz w:val="21"/>
-          <w:szCs w:val="21"/>
-          <w14:ligatures w14:val="none"/>
-        </w:rPr>
-      </w:pPr>
-      <w:r>
-        <w:rPr>
-          <w:rFonts w:ascii="Onest" w:eastAsia="Times New Roman" w:hAnsi="Onest" w:cs="Segoe UI"/>
-          <w:b/>
-          <w:bCs/>
-          <w:kern w:val="0"/>
-          <w:sz w:val="21"/>
-          <w:szCs w:val="21"/>
-          <w14:ligatures w14:val="none"/>
-        </w:rPr>
-        <w:t xml:space="preserve">Q: </w:t>
-      </w:r>
-      <w:r>
-        <w:rPr>
-          <w:rFonts w:ascii="Onest" w:eastAsia="Times New Roman" w:hAnsi="Onest" w:cs="Segoe UI"/>
-          <w:b/>
-          <w:bCs/>
-          <w:kern w:val="0"/>
-          <w:sz w:val="21"/>
-          <w:szCs w:val="21"/>
-          <w14:ligatures w14:val="none"/>
-        </w:rPr>
-        <w:t>Do you need a 3D printer</w:t>
-      </w:r>
-      <w:r>
-        <w:rPr>
-          <w:rFonts w:ascii="Onest" w:eastAsia="Times New Roman" w:hAnsi="Onest" w:cs="Segoe UI"/>
-          <w:b/>
-          <w:bCs/>
-          <w:kern w:val="0"/>
-          <w:sz w:val="21"/>
-          <w:szCs w:val="21"/>
-          <w14:ligatures w14:val="none"/>
-        </w:rPr>
-        <w:t>?</w:t>
-      </w:r>
-      <w:r>
-        <w:rPr>
-          <w:rFonts w:ascii="Onest" w:eastAsia="Times New Roman" w:hAnsi="Onest" w:cs="Segoe UI"/>
-          <w:kern w:val="0"/>
-          <w:sz w:val="21"/>
-          <w:szCs w:val="21"/>
-          <w14:ligatures w14:val="none"/>
-        </w:rPr>
-        <w:br/>
-      </w:r>
-      <w:r>
-        <w:rPr>
-          <w:rFonts w:ascii="Onest" w:eastAsia="Times New Roman" w:hAnsi="Onest" w:cs="Segoe UI"/>
-          <w:kern w:val="0"/>
-          <w:sz w:val="21"/>
-          <w:szCs w:val="21"/>
-          <w14:ligatures w14:val="none"/>
-        </w:rPr>
-        <w:t xml:space="preserve">Currently, yes. We’re </w:t>
-      </w:r>
-      <w:r>
-        <w:rPr>
-          <w:rFonts w:ascii="Onest" w:eastAsia="Times New Roman" w:hAnsi="Onest" w:cs="Segoe UI"/>
-          <w:kern w:val="0"/>
-          <w:sz w:val="21"/>
-          <w:szCs w:val="21"/>
-          <w14:ligatures w14:val="none"/>
-        </w:rPr>
-        <w:t>investigating</w:t>
-      </w:r>
-      <w:r>
-        <w:rPr>
-          <w:rFonts w:ascii="Onest" w:eastAsia="Times New Roman" w:hAnsi="Onest" w:cs="Segoe UI"/>
-          <w:kern w:val="0"/>
-          <w:sz w:val="21"/>
-          <w:szCs w:val="21"/>
-          <w14:ligatures w14:val="none"/>
-        </w:rPr>
-        <w:t xml:space="preserve"> a solution </w:t>
-      </w:r>
-      <w:r>
-        <w:rPr>
-          <w:rFonts w:ascii="Onest" w:eastAsia="Times New Roman" w:hAnsi="Onest" w:cs="Segoe UI"/>
-          <w:kern w:val="0"/>
-          <w:sz w:val="21"/>
-          <w:szCs w:val="21"/>
-          <w14:ligatures w14:val="none"/>
-        </w:rPr>
-        <w:t xml:space="preserve">for kits </w:t>
-      </w:r>
-      <w:r>
-        <w:rPr>
-          <w:rFonts w:ascii="Onest" w:eastAsia="Times New Roman" w:hAnsi="Onest" w:cs="Segoe UI"/>
-          <w:kern w:val="0"/>
-          <w:sz w:val="21"/>
-          <w:szCs w:val="21"/>
-          <w14:ligatures w14:val="none"/>
-        </w:rPr>
-        <w:t>that have all the necessary pieces. However, until those are available, the parts for the robot arm must be 3D printed.</w:t>
-      </w:r>
-      <w:r>
-        <w:rPr>
-          <w:rFonts w:ascii="Onest" w:eastAsia="Times New Roman" w:hAnsi="Onest" w:cs="Segoe UI"/>
-          <w:kern w:val="0"/>
-          <w:sz w:val="21"/>
-          <w:szCs w:val="21"/>
-          <w14:ligatures w14:val="none"/>
-        </w:rPr>
-        <w:t xml:space="preserve"> They do not necessarily have to be printed by the students</w:t>
-      </w:r>
-      <w:r>
-        <w:rPr>
-          <w:rFonts w:ascii="Onest" w:eastAsia="Times New Roman" w:hAnsi="Onest" w:cs="Segoe UI"/>
-          <w:kern w:val="0"/>
-          <w:sz w:val="21"/>
-          <w:szCs w:val="21"/>
-          <w14:ligatures w14:val="none"/>
-        </w:rPr>
-        <w:t xml:space="preserve"> if the instructor has time to do that ahead of time.</w:t>
-      </w:r>
-    </w:p>
-    <w:p>
-      <w:pPr>
-        <w:spacing w:before="100" w:beforeAutospacing="1" w:after="100" w:afterAutospacing="1" w:line="300" w:lineRule="atLeast"/>
-        <w:rPr>
-          <w:rFonts w:ascii="Onest" w:eastAsia="Times New Roman" w:hAnsi="Onest" w:cs="Segoe UI"/>
-          <w:kern w:val="0"/>
-          <w:sz w:val="21"/>
-          <w:szCs w:val="21"/>
-          <w14:ligatures w14:val="none"/>
-        </w:rPr>
-      </w:pPr>
-      <w:r>
-        <w:rPr>
-          <w:rFonts w:ascii="Onest" w:eastAsia="Times New Roman" w:hAnsi="Onest" w:cs="Segoe UI"/>
-          <w:b/>
-          <w:bCs/>
-          <w:kern w:val="0"/>
-          <w:sz w:val="21"/>
-          <w:szCs w:val="21"/>
-          <w14:ligatures w14:val="none"/>
-        </w:rPr>
-        <w:t xml:space="preserve">Q: Is this </w:t>
-      </w:r>
-      <w:r>
-        <w:rPr>
-          <w:rFonts w:ascii="Onest" w:eastAsia="Times New Roman" w:hAnsi="Onest" w:cs="Segoe UI"/>
-          <w:b/>
-          <w:bCs/>
-          <w:kern w:val="0"/>
-          <w:sz w:val="21"/>
-          <w:szCs w:val="21"/>
-          <w14:ligatures w14:val="none"/>
-        </w:rPr>
-        <w:t xml:space="preserve">project </w:t>
-      </w:r>
-      <w:r>
-        <w:rPr>
-          <w:rFonts w:ascii="Onest" w:eastAsia="Times New Roman" w:hAnsi="Onest" w:cs="Segoe UI"/>
-          <w:b/>
-          <w:bCs/>
-          <w:kern w:val="0"/>
-          <w:sz w:val="21"/>
-          <w:szCs w:val="21"/>
-          <w14:ligatures w14:val="none"/>
-        </w:rPr>
-        <w:t>safe?</w:t>
-      </w:r>
-      <w:r>
-        <w:rPr>
-          <w:rFonts w:ascii="Onest" w:eastAsia="Times New Roman" w:hAnsi="Onest" w:cs="Segoe UI"/>
-          <w:kern w:val="0"/>
-          <w:sz w:val="21"/>
-          <w:szCs w:val="21"/>
-          <w14:ligatures w14:val="none"/>
-        </w:rPr>
-        <w:br/>
-        <w:t>Yes</w:t>
-      </w:r>
-      <w:r>
-        <w:rPr>
-          <w:rFonts w:ascii="Onest" w:eastAsia="Times New Roman" w:hAnsi="Onest" w:cs="Segoe UI"/>
-          <w:kern w:val="0"/>
-          <w:sz w:val="21"/>
-          <w:szCs w:val="21"/>
-          <w14:ligatures w14:val="none"/>
-        </w:rPr>
-        <w:t xml:space="preserve">, but beginner students should </w:t>
-      </w:r>
-      <w:r>
-        <w:rPr>
-          <w:rFonts w:ascii="Onest" w:eastAsia="Times New Roman" w:hAnsi="Onest" w:cs="Segoe UI"/>
-          <w:kern w:val="0"/>
-          <w:sz w:val="21"/>
-          <w:szCs w:val="21"/>
-          <w14:ligatures w14:val="none"/>
-        </w:rPr>
-        <w:t xml:space="preserve">have electrical discipline and </w:t>
-      </w:r>
-      <w:r>
-        <w:rPr>
-          <w:rFonts w:ascii="Onest" w:eastAsia="Times New Roman" w:hAnsi="Onest" w:cs="Segoe UI"/>
-          <w:kern w:val="0"/>
-          <w:sz w:val="21"/>
-          <w:szCs w:val="21"/>
-          <w14:ligatures w14:val="none"/>
-        </w:rPr>
-        <w:t xml:space="preserve">be informed about </w:t>
-      </w:r>
-      <w:r>
-        <w:rPr>
-          <w:rFonts w:ascii="Onest" w:eastAsia="Times New Roman" w:hAnsi="Onest" w:cs="Segoe UI"/>
-          <w:kern w:val="0"/>
-          <w:sz w:val="21"/>
-          <w:szCs w:val="21"/>
-          <w14:ligatures w14:val="none"/>
-        </w:rPr>
-        <w:t xml:space="preserve">proper </w:t>
-      </w:r>
-      <w:r>
-        <w:rPr>
-          <w:rFonts w:ascii="Onest" w:eastAsia="Times New Roman" w:hAnsi="Onest" w:cs="Segoe UI"/>
-          <w:kern w:val="0"/>
-          <w:sz w:val="21"/>
-          <w:szCs w:val="21"/>
-          <w14:ligatures w14:val="none"/>
-        </w:rPr>
-        <w:lastRenderedPageBreak/>
-        <w:t xml:space="preserve">handling embedded systems (exposed power pins, </w:t>
-      </w:r>
-      <w:r>
-        <w:rPr>
-          <w:rFonts w:ascii="Onest" w:eastAsia="Times New Roman" w:hAnsi="Onest" w:cs="Segoe UI"/>
-          <w:kern w:val="0"/>
-          <w:sz w:val="21"/>
-          <w:szCs w:val="21"/>
-          <w14:ligatures w14:val="none"/>
-        </w:rPr>
-        <w:t xml:space="preserve">shocks, </w:t>
-      </w:r>
-      <w:proofErr w:type="spellStart"/>
-      <w:r>
-        <w:rPr>
-          <w:rFonts w:ascii="Onest" w:eastAsia="Times New Roman" w:hAnsi="Onest" w:cs="Segoe UI"/>
-          <w:kern w:val="0"/>
-          <w:sz w:val="21"/>
-          <w:szCs w:val="21"/>
-          <w14:ligatures w14:val="none"/>
-        </w:rPr>
-        <w:t>etc</w:t>
-      </w:r>
-      <w:proofErr w:type="spellEnd"/>
-      <w:r>
-        <w:rPr>
-          <w:rFonts w:ascii="Onest" w:eastAsia="Times New Roman" w:hAnsi="Onest" w:cs="Segoe UI"/>
-          <w:kern w:val="0"/>
-          <w:sz w:val="21"/>
-          <w:szCs w:val="21"/>
-          <w14:ligatures w14:val="none"/>
-        </w:rPr>
-        <w:t>). Also, some care is needed around moving parts</w:t>
-      </w:r>
-      <w:r>
-        <w:rPr>
-          <w:rFonts w:ascii="Onest" w:eastAsia="Times New Roman" w:hAnsi="Onest" w:cs="Segoe UI"/>
-          <w:kern w:val="0"/>
-          <w:sz w:val="21"/>
-          <w:szCs w:val="21"/>
-          <w14:ligatures w14:val="none"/>
-        </w:rPr>
-        <w:t xml:space="preserve"> to avoid pinch points.</w:t>
+        <w:t>No software-only configuration makes an exposed robot arm inherently safe. The secured profile refuses to arm until a board-specific OE or servo-power hook is integrated. Use instructor supervision, a guarded clear zone, calibrated limits, and a physical emergency stop. Commission with servo power disabled first; a fault must disable output rather than move to a home pose.</w:t>
       </w:r>
     </w:p>
     <w:sectPr>
@@ -5061,141 +4612,125 @@
 
 <file path=word/header1.xml><?xml version="1.0" encoding="utf-8"?>
 <w:hdr xmlns:wpc="http://schemas.microsoft.com/office/word/2010/wordprocessingCanvas" xmlns:cx="http://schemas.microsoft.com/office/drawing/2014/chartex" xmlns:cx1="http://schemas.microsoft.com/office/drawing/2015/9/8/chartex" xmlns:cx2="http://schemas.microsoft.com/office/drawing/2015/10/21/chartex" xmlns:cx3="http://schemas.microsoft.com/office/drawing/2016/5/9/chartex" xmlns:cx4="http://schemas.microsoft.com/office/drawing/2016/5/10/chartex" xmlns:cx5="http://schemas.microsoft.com/office/drawing/2016/5/11/chartex" xmlns:cx6="http://schemas.microsoft.com/office/drawing/2016/5/12/chartex" xmlns:cx7="http://schemas.microsoft.com/office/drawing/2016/5/13/chartex" xmlns:cx8="http://schemas.microsoft.com/office/drawing/2016/5/14/chartex" xmlns:mc="http://schemas.openxmlformats.org/markup-compatibility/2006" xmlns:aink="http://schemas.microsoft.com/office/drawing/2016/ink" xmlns:am3d="http://schemas.microsoft.com/office/drawing/2017/model3d" xmlns:o="urn:schemas-microsoft-com:office:office" xmlns:oel="http://schemas.microsoft.com/office/2019/extlst" xmlns:r="http://schemas.openxmlformats.org/officeDocument/2006/relationships" xmlns:m="http://schemas.openxmlformats.org/officeDocument/2006/math" xmlns:v="urn:schemas-microsoft-com:vml" xmlns:wp14="http://schemas.microsoft.com/office/word/2010/wordprocessingDrawing" xmlns:wp="http://schemas.openxmlformats.org/drawingml/2006/wordprocessingDrawing" xmlns:w10="urn:schemas-microsoft-com:office:word" xmlns:w="http://schemas.openxmlformats.org/wordprocessingml/2006/main" xmlns:w14="http://schemas.microsoft.com/office/word/2010/wordml" xmlns:w15="http://schemas.microsoft.com/office/word/2012/wordml" xmlns:w16cex="http://schemas.microsoft.com/office/word/2018/wordml/cex" xmlns:w16cid="http://schemas.microsoft.com/office/word/2016/wordml/cid" xmlns:w16="http://schemas.microsoft.com/office/word/2018/wordml" xmlns:w16du="http://schemas.microsoft.com/office/word/2023/wordml/word16du" xmlns:w16sdtdh="http://schemas.microsoft.com/office/word/2020/wordml/sdtdatahash" xmlns:w16sdtfl="http://schemas.microsoft.com/office/word/2024/wordml/sdtformatlock" xmlns:w16se="http://schemas.microsoft.com/office/word/2015/wordml/symex" xmlns:wpg="http://schemas.microsoft.com/office/word/2010/wordprocessingGroup" xmlns:wpi="http://schemas.microsoft.com/office/word/2010/wordprocessingInk" xmlns:wne="http://schemas.microsoft.com/office/word/2006/wordml" xmlns:wps="http://schemas.microsoft.com/office/word/2010/wordprocessingShape" mc:Ignorable="w14 w15 w16se w16cid w16 w16cex w16sdtdh w16sdtfl w16du wp14">
+  <w:tbl>
+    <w:tblPr>
+      <w:tblW w:type="auto" w:w="0"/>
+      <w:jc w:val="left"/>
+      <w:tblLayout w:type="fixed"/>
+      <w:tblLook w:firstColumn="1" w:firstRow="1" w:lastColumn="0" w:lastRow="0" w:noHBand="0" w:noVBand="1" w:val="04A0"/>
+      <w:tblBorders>
+        <w:top w:val="nil"/>
+        <w:left w:val="nil"/>
+        <w:bottom w:val="nil"/>
+        <w:right w:val="nil"/>
+        <w:insideH w:val="nil"/>
+        <w:insideV w:val="nil"/>
+      </w:tblBorders>
+    </w:tblPr>
+    <w:tblGrid>
+      <w:gridCol w:w="1800"/>
+      <w:gridCol w:w="7560"/>
+    </w:tblGrid>
+    <w:tr>
+      <w:tc>
+        <w:tcPr>
+          <w:tcW w:type="dxa" w:w="1800"/>
+          <w:vAlign w:val="center"/>
+          <w:tcMar>
+            <w:top w:w="0" w:type="dxa"/>
+            <w:start w:w="0" w:type="dxa"/>
+            <w:bottom w:w="0" w:type="dxa"/>
+            <w:end w:w="120" w:type="dxa"/>
+          </w:tcMar>
+        </w:tcPr>
+        <w:p>
+          <w:pPr>
+            <w:spacing w:before="0" w:after="0"/>
+            <w:jc w:val="left"/>
+          </w:pPr>
+          <w:r>
+            <w:drawing>
+              <wp:inline xmlns:a="http://schemas.openxmlformats.org/drawingml/2006/main" xmlns:pic="http://schemas.openxmlformats.org/drawingml/2006/picture">
+                <wp:extent cx="960120" cy="589835"/>
+                <wp:docPr id="1" name="Picture 1"/>
+                <wp:cNvGraphicFramePr>
+                  <a:graphicFrameLocks noChangeAspect="1"/>
+                </wp:cNvGraphicFramePr>
+                <a:graphic>
+                  <a:graphicData uri="http://schemas.openxmlformats.org/drawingml/2006/picture">
+                    <pic:pic>
+                      <pic:nvPicPr>
+                        <pic:cNvPr id="0" name="image.png"/>
+                        <pic:cNvPicPr/>
+                      </pic:nvPicPr>
+                      <pic:blipFill>
+                        <a:blip r:embed="rId1"/>
+                        <a:stretch>
+                          <a:fillRect/>
+                        </a:stretch>
+                      </pic:blipFill>
+                      <pic:spPr>
+                        <a:xfrm>
+                          <a:off x="0" y="0"/>
+                          <a:ext cx="960120" cy="589835"/>
+                        </a:xfrm>
+                        <a:prstGeom prst="rect"/>
+                      </pic:spPr>
+                    </pic:pic>
+                  </a:graphicData>
+                </a:graphic>
+              </wp:inline>
+            </w:drawing>
+          </w:r>
+        </w:p>
+      </w:tc>
+      <w:tc>
+        <w:tcPr>
+          <w:tcW w:type="dxa" w:w="7560"/>
+          <w:vAlign w:val="center"/>
+          <w:tcMar>
+            <w:top w:w="0" w:type="dxa"/>
+            <w:start w:w="0" w:type="dxa"/>
+            <w:bottom w:w="0" w:type="dxa"/>
+            <w:end w:w="0" w:type="dxa"/>
+          </w:tcMar>
+        </w:tcPr>
+        <w:p>
+          <w:pPr>
+            <w:spacing w:before="0" w:after="40"/>
+            <w:jc w:val="left"/>
+          </w:pPr>
+          <w:r>
+            <w:rPr>
+              <w:rFonts w:ascii="Onest" w:hAnsi="Onest"/>
+              <w:b/>
+              <w:sz w:val="36"/>
+            </w:rPr>
+            <w:t>Hands-On Teaching Module</w:t>
+          </w:r>
+        </w:p>
+        <w:p>
+          <w:pPr>
+            <w:spacing w:before="0" w:after="0"/>
+            <w:jc w:val="left"/>
+          </w:pPr>
+          <w:r>
+            <w:rPr>
+              <w:rFonts w:ascii="Onest" w:hAnsi="Onest"/>
+              <w:b/>
+              <w:sz w:val="22"/>
+            </w:rPr>
+            <w:t>Baby Robot Arm with Gamepad Control</w:t>
+          </w:r>
+        </w:p>
+      </w:tc>
+    </w:tr>
+  </w:tbl>
   <w:p>
     <w:pPr>
-      <w:pStyle w:val="Header"/>
-      <w:rPr>
-        <w:rFonts w:ascii="Onest" w:hAnsi="Onest"/>
-        <w:b/>
-        <w:bCs/>
-        <w:sz w:val="28"/>
-        <w:szCs w:val="28"/>
-      </w:rPr>
-    </w:pPr>
-    <w:r>
-      <w:rPr>
-        <w:rFonts w:ascii="Onest" w:eastAsia="Times New Roman" w:hAnsi="Onest" w:cs="Segoe UI"/>
-        <w:b/>
-        <w:bCs/>
-        <w:noProof/>
-        <w:kern w:val="36"/>
-        <w:sz w:val="52"/>
-        <w:szCs w:val="52"/>
-      </w:rPr>
-      <w:drawing>
-        <wp:anchor distT="0" distB="0" distL="114300" distR="114300" simplePos="0" relativeHeight="251658240" behindDoc="0" locked="0" layoutInCell="1" allowOverlap="1" wp14:anchorId="10DC963B" wp14:editId="5D8378F9">
-          <wp:simplePos x="0" y="0"/>
-          <wp:positionH relativeFrom="column">
-            <wp:posOffset>-351022</wp:posOffset>
-          </wp:positionH>
-          <wp:positionV relativeFrom="paragraph">
-            <wp:posOffset>-84244</wp:posOffset>
-          </wp:positionV>
-          <wp:extent cx="1346400" cy="828000"/>
-          <wp:effectExtent l="0" t="0" r="0" b="0"/>
-          <wp:wrapSquare wrapText="bothSides"/>
-          <wp:docPr id="1349721846" name="Picture 1"/>
-          <wp:cNvGraphicFramePr>
-            <a:graphicFrameLocks xmlns:a="http://schemas.openxmlformats.org/drawingml/2006/main" noChangeAspect="1"/>
-          </wp:cNvGraphicFramePr>
-          <a:graphic xmlns:a="http://schemas.openxmlformats.org/drawingml/2006/main">
-            <a:graphicData uri="http://schemas.openxmlformats.org/drawingml/2006/picture">
-              <pic:pic xmlns:pic="http://schemas.openxmlformats.org/drawingml/2006/picture">
-                <pic:nvPicPr>
-                  <pic:cNvPr id="1349721846" name="Picture 1349721846"/>
-                  <pic:cNvPicPr/>
-                </pic:nvPicPr>
-                <pic:blipFill>
-                  <a:blip r:embed="rId1">
-                    <a:extLst>
-                      <a:ext uri="{28A0092B-C50C-407E-A947-70E740481C1C}">
-                        <a14:useLocalDpi xmlns:a14="http://schemas.microsoft.com/office/drawing/2010/main" val="0"/>
-                      </a:ext>
-                    </a:extLst>
-                  </a:blip>
-                  <a:stretch>
-                    <a:fillRect/>
-                  </a:stretch>
-                </pic:blipFill>
-                <pic:spPr>
-                  <a:xfrm>
-                    <a:off x="0" y="0"/>
-                    <a:ext cx="1346400" cy="828000"/>
-                  </a:xfrm>
-                  <a:prstGeom prst="rect">
-                    <a:avLst/>
-                  </a:prstGeom>
-                </pic:spPr>
-              </pic:pic>
-            </a:graphicData>
-          </a:graphic>
-          <wp14:sizeRelH relativeFrom="margin">
-            <wp14:pctWidth>0</wp14:pctWidth>
-          </wp14:sizeRelH>
-          <wp14:sizeRelV relativeFrom="margin">
-            <wp14:pctHeight>0</wp14:pctHeight>
-          </wp14:sizeRelV>
-        </wp:anchor>
-      </w:drawing>
-    </w:r>
-    <w:r>
-      <w:rPr>
-        <w:rFonts w:ascii="Onest" w:hAnsi="Onest"/>
-        <w:b/>
-        <w:bCs/>
-        <w:sz w:val="36"/>
-        <w:szCs w:val="36"/>
-      </w:rPr>
-      <w:t>Hands-On Teaching</w:t>
-    </w:r>
-    <w:r>
-      <w:rPr>
-        <w:rFonts w:ascii="Onest" w:hAnsi="Onest"/>
-        <w:b/>
-        <w:bCs/>
-        <w:sz w:val="36"/>
-        <w:szCs w:val="36"/>
-      </w:rPr>
-      <w:t xml:space="preserve"> Module</w:t>
-    </w:r>
-    <w:r>
-      <w:rPr>
-        <w:rFonts w:ascii="Onest" w:hAnsi="Onest"/>
-        <w:b/>
-        <w:bCs/>
-        <w:sz w:val="36"/>
-        <w:szCs w:val="36"/>
-      </w:rPr>
-      <w:t xml:space="preserve"> </w:t>
-    </w:r>
-  </w:p>
-  <w:p>
-    <w:pPr>
-      <w:pStyle w:val="Header"/>
-      <w:rPr>
-        <w:rFonts w:ascii="Onest" w:hAnsi="Onest"/>
-      </w:rPr>
+      <w:spacing w:before="0" w:after="0" w:line="240" w:lineRule="auto"/>
     </w:pPr>
   </w:p>
-  <w:p>
-    <w:pPr>
-      <w:pStyle w:val="Header"/>
-      <w:rPr>
-        <w:rFonts w:ascii="Onest" w:hAnsi="Onest"/>
-        <w:b/>
-        <w:bCs/>
-      </w:rPr>
-    </w:pPr>
-    <w:r>
-      <w:rPr>
-        <w:rFonts w:ascii="Onest" w:hAnsi="Onest"/>
-        <w:b/>
-        <w:bCs/>
-      </w:rPr>
-      <w:t>Baby Robot Arm with Gamepad Control</w:t>
-    </w:r>
-  </w:p>
-  <w:p/>
 </w:hdr>
 </file>
 

</xml_diff>